<commit_message>
New stet_en.docx input document A new stet_en.docx was requested and provided through JIRA
</commit_message>
<xml_diff>
--- a/backend/document/stet/data/stet_en.docx
+++ b/backend/document/stet/data/stet_en.docx
@@ -839,7 +839,13 @@
               <w:pStyle w:val="Compact"/>
             </w:pPr>
             <w:r>
-              <w:t>Hebrews 11:6</w:t>
+              <w:t>Hebrews 11:</w:t>
+            </w:r>
+            <w:r>
+              <w:t>1</w:t>
+            </w:r>
+            <w:r>
+              <w:t>6</w:t>
             </w:r>
           </w:p>
           <w:p>
@@ -1694,11 +1700,6 @@
           </w:p>
           <w:p>
             <w:r>
-              <w:t>Hebrews 8:7</w:t>
-            </w:r>
-          </w:p>
-          <w:p>
-            <w:r>
               <w:t>Hebrews 9:14</w:t>
             </w:r>
           </w:p>
@@ -1811,32 +1812,12 @@
           </w:p>
           <w:p>
             <w:r>
-              <w:t>Ephesians 4:31</w:t>
+              <w:t>1 Timothy 1:20</w:t>
             </w:r>
           </w:p>
           <w:p>
             <w:r>
               <w:lastRenderedPageBreak/>
-              <w:t>Colossians 3:8</w:t>
-            </w:r>
-          </w:p>
-          <w:p>
-            <w:r>
-              <w:t>1 Timothy 1:20</w:t>
-            </w:r>
-          </w:p>
-          <w:p>
-            <w:r>
-              <w:t>Jude 1:9</w:t>
-            </w:r>
-          </w:p>
-          <w:p>
-            <w:r>
-              <w:t>Revelation 2:9</w:t>
-            </w:r>
-          </w:p>
-          <w:p>
-            <w:r>
               <w:t>Revelation 17:3</w:t>
             </w:r>
           </w:p>
@@ -3939,7 +3920,10 @@
               <w:pStyle w:val="Compact"/>
             </w:pPr>
             <w:r>
-              <w:t xml:space="preserve">Philippians 2:8 </w:t>
+              <w:t>Philippians 2:8</w:t>
+            </w:r>
+            <w:r>
+              <w:t xml:space="preserve"> </w:t>
             </w:r>
           </w:p>
           <w:p>
@@ -4134,7 +4118,10 @@
           </w:p>
           <w:p>
             <w:r>
-              <w:t>Galatians 2:20</w:t>
+              <w:t>Galatians 2:</w:t>
+            </w:r>
+            <w:r>
+              <w:t>19</w:t>
             </w:r>
           </w:p>
           <w:p>
@@ -5512,14 +5499,6 @@
             </w:pPr>
             <w:r>
               <w:lastRenderedPageBreak/>
-              <w:t xml:space="preserve">Acts 17:29 </w:t>
-            </w:r>
-          </w:p>
-          <w:p>
-            <w:pPr>
-              <w:pStyle w:val="Compact"/>
-            </w:pPr>
-            <w:r>
               <w:t xml:space="preserve">Romans 1:20 </w:t>
             </w:r>
           </w:p>
@@ -6164,11 +6143,6 @@
           </w:p>
           <w:p>
             <w:r>
-              <w:t>2 Timothy 1:9</w:t>
-            </w:r>
-          </w:p>
-          <w:p>
-            <w:r>
               <w:t>Hebrews 5:9</w:t>
             </w:r>
           </w:p>
@@ -7213,7 +7187,10 @@
           </w:p>
           <w:p>
             <w:r>
-              <w:t>Romans 8:1</w:t>
+              <w:t>Romans 8:</w:t>
+            </w:r>
+            <w:r>
+              <w:t>3</w:t>
             </w:r>
           </w:p>
           <w:p>
@@ -7920,11 +7897,6 @@
           </w:tcPr>
           <w:p>
             <w:r>
-              <w:t>Matthew 6:13</w:t>
-            </w:r>
-          </w:p>
-          <w:p>
-            <w:r>
               <w:t>Mark 13:26</w:t>
             </w:r>
           </w:p>
@@ -8370,7 +8342,6 @@
               </w:numPr>
             </w:pPr>
             <w:r>
-              <w:lastRenderedPageBreak/>
               <w:t>T</w:t>
             </w:r>
             <w:r>
@@ -8386,6 +8357,7 @@
               </w:numPr>
             </w:pPr>
             <w:r>
+              <w:lastRenderedPageBreak/>
               <w:t>T</w:t>
             </w:r>
             <w:r>
@@ -8469,21 +8441,21 @@
           </w:p>
           <w:p>
             <w:r>
+              <w:t>Luke 18:</w:t>
+            </w:r>
+            <w:r>
+              <w:t>19</w:t>
+            </w:r>
+            <w:r>
+              <w:t xml:space="preserve"> (*</w:t>
+            </w:r>
+            <w:r>
+              <w:t>)</w:t>
+            </w:r>
+          </w:p>
+          <w:p>
+            <w:r>
               <w:lastRenderedPageBreak/>
-              <w:t>Luke 18:</w:t>
-            </w:r>
-            <w:r>
-              <w:t>19</w:t>
-            </w:r>
-            <w:r>
-              <w:t xml:space="preserve"> (*</w:t>
-            </w:r>
-            <w:r>
-              <w:t>)</w:t>
-            </w:r>
-          </w:p>
-          <w:p>
-            <w:r>
               <w:t>John 7:12</w:t>
             </w:r>
           </w:p>
@@ -8778,7 +8750,6 @@
               </w:numPr>
             </w:pPr>
             <w:r>
-              <w:lastRenderedPageBreak/>
               <w:t>Blessing.</w:t>
             </w:r>
           </w:p>
@@ -8789,59 +8760,58 @@
           </w:tcPr>
           <w:p>
             <w:r>
+              <w:t>Luke 1:</w:t>
+            </w:r>
+            <w:r>
+              <w:t>3</w:t>
+            </w:r>
+            <w:r>
+              <w:t>0</w:t>
+            </w:r>
+          </w:p>
+          <w:p>
+            <w:r>
+              <w:t>John 1:17</w:t>
+            </w:r>
+          </w:p>
+          <w:p>
+            <w:r>
+              <w:t>Acts 4:33</w:t>
+            </w:r>
+          </w:p>
+          <w:p>
+            <w:r>
+              <w:t>Romans 3:24</w:t>
+            </w:r>
+          </w:p>
+          <w:p>
+            <w:r>
+              <w:t>1 Corinthians 15:10</w:t>
+            </w:r>
+          </w:p>
+          <w:p>
+            <w:r>
+              <w:t>2 Corinthians 4:15</w:t>
+            </w:r>
+          </w:p>
+          <w:p>
+            <w:r>
+              <w:t>Galatians 2:21</w:t>
+            </w:r>
+          </w:p>
+          <w:p>
+            <w:r>
+              <w:t>Ephesians 2:8</w:t>
+            </w:r>
+          </w:p>
+          <w:p>
+            <w:r>
+              <w:t>Philippians 4:23</w:t>
+            </w:r>
+          </w:p>
+          <w:p>
+            <w:r>
               <w:lastRenderedPageBreak/>
-              <w:t>Luke 1:</w:t>
-            </w:r>
-            <w:r>
-              <w:t>3</w:t>
-            </w:r>
-            <w:r>
-              <w:t>0</w:t>
-            </w:r>
-          </w:p>
-          <w:p>
-            <w:r>
-              <w:t>John 1:17</w:t>
-            </w:r>
-          </w:p>
-          <w:p>
-            <w:r>
-              <w:t>Acts 4:33</w:t>
-            </w:r>
-          </w:p>
-          <w:p>
-            <w:r>
-              <w:t>Romans 3:24</w:t>
-            </w:r>
-          </w:p>
-          <w:p>
-            <w:r>
-              <w:t>1 Corinthians 15:10</w:t>
-            </w:r>
-          </w:p>
-          <w:p>
-            <w:r>
-              <w:t>2 Corinthians 4:15</w:t>
-            </w:r>
-          </w:p>
-          <w:p>
-            <w:r>
-              <w:t>Galatians 2:21</w:t>
-            </w:r>
-          </w:p>
-          <w:p>
-            <w:r>
-              <w:t>Ephesians 2:8</w:t>
-            </w:r>
-          </w:p>
-          <w:p>
-            <w:r>
-              <w:lastRenderedPageBreak/>
-              <w:t>Philippians 4:23</w:t>
-            </w:r>
-          </w:p>
-          <w:p>
-            <w:r>
               <w:t>Colossians 4:6</w:t>
             </w:r>
           </w:p>
@@ -9255,12 +9225,6 @@
           </w:p>
           <w:p>
             <w:r>
-              <w:t>1 John 5:7</w:t>
-            </w:r>
-          </w:p>
-          <w:p>
-            <w:r>
-              <w:lastRenderedPageBreak/>
               <w:t>Revelation 3:12</w:t>
             </w:r>
           </w:p>
@@ -9741,7 +9705,6 @@
           <w:p/>
           <w:p>
             <w:r>
-              <w:lastRenderedPageBreak/>
               <w:t xml:space="preserve">When this </w:t>
             </w:r>
             <w:r>
@@ -9772,6 +9735,7 @@
               </w:numPr>
             </w:pPr>
             <w:r>
+              <w:lastRenderedPageBreak/>
               <w:t>Someone or something that is set apart and dedicated to serve God.</w:t>
             </w:r>
           </w:p>
@@ -9820,49 +9784,49 @@
               <w:pStyle w:val="Compact"/>
             </w:pPr>
             <w:r>
+              <w:t>Acts 4:27</w:t>
+            </w:r>
+            <w:r>
+              <w:t xml:space="preserve"> </w:t>
+            </w:r>
+          </w:p>
+          <w:p>
+            <w:pPr>
+              <w:pStyle w:val="Compact"/>
+            </w:pPr>
+            <w:r>
+              <w:t>Romans 12:1</w:t>
+            </w:r>
+            <w:r>
+              <w:t xml:space="preserve"> </w:t>
+            </w:r>
+          </w:p>
+          <w:p>
+            <w:pPr>
+              <w:pStyle w:val="Compact"/>
+            </w:pPr>
+            <w:r>
+              <w:t xml:space="preserve">1 Corinthians </w:t>
+            </w:r>
+            <w:r>
+              <w:t>3</w:t>
+            </w:r>
+            <w:r>
+              <w:t>:</w:t>
+            </w:r>
+            <w:r>
+              <w:t>17</w:t>
+            </w:r>
+            <w:r>
+              <w:t xml:space="preserve"> </w:t>
+            </w:r>
+          </w:p>
+          <w:p>
+            <w:pPr>
+              <w:pStyle w:val="Compact"/>
+            </w:pPr>
+            <w:r>
               <w:lastRenderedPageBreak/>
-              <w:t>Acts 4:27</w:t>
-            </w:r>
-            <w:r>
-              <w:t xml:space="preserve"> </w:t>
-            </w:r>
-          </w:p>
-          <w:p>
-            <w:pPr>
-              <w:pStyle w:val="Compact"/>
-            </w:pPr>
-            <w:r>
-              <w:t>Romans 12:1</w:t>
-            </w:r>
-            <w:r>
-              <w:t xml:space="preserve"> </w:t>
-            </w:r>
-          </w:p>
-          <w:p>
-            <w:pPr>
-              <w:pStyle w:val="Compact"/>
-            </w:pPr>
-            <w:r>
-              <w:t xml:space="preserve">1 Corinthians </w:t>
-            </w:r>
-            <w:r>
-              <w:t>3</w:t>
-            </w:r>
-            <w:r>
-              <w:t>:</w:t>
-            </w:r>
-            <w:r>
-              <w:t>17</w:t>
-            </w:r>
-            <w:r>
-              <w:t xml:space="preserve"> </w:t>
-            </w:r>
-          </w:p>
-          <w:p>
-            <w:pPr>
-              <w:pStyle w:val="Compact"/>
-            </w:pPr>
-            <w:r>
               <w:t>Ephesians 1:4</w:t>
             </w:r>
             <w:r>
@@ -10230,43 +10194,43 @@
               <w:pStyle w:val="Compact"/>
             </w:pPr>
             <w:r>
+              <w:t>1 Corinthians 12:24</w:t>
+            </w:r>
+          </w:p>
+          <w:p>
+            <w:pPr>
+              <w:pStyle w:val="Compact"/>
+            </w:pPr>
+            <w:r>
+              <w:t>Ephesians 6:2</w:t>
+            </w:r>
+          </w:p>
+          <w:p>
+            <w:pPr>
+              <w:pStyle w:val="Compact"/>
+            </w:pPr>
+            <w:r>
+              <w:t xml:space="preserve">1 Timothy </w:t>
+            </w:r>
+            <w:r>
+              <w:t>1</w:t>
+            </w:r>
+            <w:r>
+              <w:t>:</w:t>
+            </w:r>
+            <w:r>
+              <w:t>17</w:t>
+            </w:r>
+            <w:r>
+              <w:t xml:space="preserve"> </w:t>
+            </w:r>
+          </w:p>
+          <w:p>
+            <w:pPr>
+              <w:pStyle w:val="Compact"/>
+            </w:pPr>
+            <w:r>
               <w:lastRenderedPageBreak/>
-              <w:t>1 Corinthians 12:24</w:t>
-            </w:r>
-          </w:p>
-          <w:p>
-            <w:pPr>
-              <w:pStyle w:val="Compact"/>
-            </w:pPr>
-            <w:r>
-              <w:t>Ephesians 6:2</w:t>
-            </w:r>
-          </w:p>
-          <w:p>
-            <w:pPr>
-              <w:pStyle w:val="Compact"/>
-            </w:pPr>
-            <w:r>
-              <w:t xml:space="preserve">1 Timothy </w:t>
-            </w:r>
-            <w:r>
-              <w:t>1</w:t>
-            </w:r>
-            <w:r>
-              <w:t>:</w:t>
-            </w:r>
-            <w:r>
-              <w:t>17</w:t>
-            </w:r>
-            <w:r>
-              <w:t xml:space="preserve"> </w:t>
-            </w:r>
-          </w:p>
-          <w:p>
-            <w:pPr>
-              <w:pStyle w:val="Compact"/>
-            </w:pPr>
-            <w:r>
               <w:t>Hebrews 2:9</w:t>
             </w:r>
           </w:p>
@@ -10719,7 +10683,6 @@
               <w:pStyle w:val="Compact"/>
             </w:pPr>
             <w:r>
-              <w:lastRenderedPageBreak/>
               <w:t xml:space="preserve">Hebrews 11:8 </w:t>
             </w:r>
           </w:p>
@@ -11036,7 +10999,6 @@
                 <w:b/>
                 <w:bCs/>
               </w:rPr>
-              <w:lastRenderedPageBreak/>
               <w:t>judge</w:t>
             </w:r>
           </w:p>
@@ -11100,6 +11062,7 @@
               </w:numPr>
             </w:pPr>
             <w:r>
+              <w:lastRenderedPageBreak/>
               <w:t>To condemn, which means to sentence someone or declare what punishment a person will receive for doing something wrong.</w:t>
             </w:r>
           </w:p>
@@ -11131,6 +11094,7 @@
               <w:pStyle w:val="Compact"/>
             </w:pPr>
             <w:r>
+              <w:lastRenderedPageBreak/>
               <w:t>Matthew 19:28</w:t>
             </w:r>
           </w:p>
@@ -11163,6 +11127,7 @@
               <w:pStyle w:val="Compact"/>
             </w:pPr>
             <w:r>
+              <w:lastRenderedPageBreak/>
               <w:t xml:space="preserve">Acts 17:31 </w:t>
             </w:r>
           </w:p>
@@ -11268,6 +11233,7 @@
                 <w:b/>
                 <w:bCs/>
               </w:rPr>
+              <w:lastRenderedPageBreak/>
               <w:t>justify</w:t>
             </w:r>
           </w:p>
@@ -11509,11 +11475,7 @@
               <w:t>(This is the way this word is used most often in the New Testament.)</w:t>
             </w:r>
             <w:r>
-              <w:t xml:space="preserve"> Sometimes this kingdom is </w:t>
-            </w:r>
-            <w:r>
-              <w:lastRenderedPageBreak/>
-              <w:t xml:space="preserve">described as being in the present. Sometimes it is described as something that will be completed in the future. </w:t>
+              <w:t xml:space="preserve"> Sometimes this kingdom is described as being in the present. Sometimes it is described as something that will be completed in the future. </w:t>
             </w:r>
           </w:p>
           <w:p/>
@@ -11564,27 +11526,27 @@
           </w:p>
           <w:p>
             <w:r>
+              <w:t>Ephesians 5:5</w:t>
+            </w:r>
+          </w:p>
+          <w:p>
+            <w:r>
+              <w:t>Colossians 1:13</w:t>
+            </w:r>
+          </w:p>
+          <w:p>
+            <w:r>
+              <w:t>2 Thessalonians 1:5</w:t>
+            </w:r>
+          </w:p>
+          <w:p>
+            <w:r>
+              <w:t>2 Timothy 4:18</w:t>
+            </w:r>
+          </w:p>
+          <w:p>
+            <w:r>
               <w:lastRenderedPageBreak/>
-              <w:t>Ephesians 5:5</w:t>
-            </w:r>
-          </w:p>
-          <w:p>
-            <w:r>
-              <w:t>Colossians 1:13</w:t>
-            </w:r>
-          </w:p>
-          <w:p>
-            <w:r>
-              <w:t>2 Thessalonians 1:5</w:t>
-            </w:r>
-          </w:p>
-          <w:p>
-            <w:r>
-              <w:t>2 Timothy 4:18</w:t>
-            </w:r>
-          </w:p>
-          <w:p>
-            <w:r>
               <w:t>Hebrews 12:28</w:t>
             </w:r>
           </w:p>
@@ -12032,22 +11994,22 @@
           </w:p>
           <w:p>
             <w:r>
+              <w:t>Romans 5:10</w:t>
+            </w:r>
+          </w:p>
+          <w:p>
+            <w:r>
+              <w:t>2 Corinthians 4:12</w:t>
+            </w:r>
+          </w:p>
+          <w:p>
+            <w:r>
+              <w:t>Galatians 6:8</w:t>
+            </w:r>
+          </w:p>
+          <w:p>
+            <w:r>
               <w:lastRenderedPageBreak/>
-              <w:t>Romans 5:10</w:t>
-            </w:r>
-          </w:p>
-          <w:p>
-            <w:r>
-              <w:t>2 Corinthians 4:12</w:t>
-            </w:r>
-          </w:p>
-          <w:p>
-            <w:r>
-              <w:t>Galatians 6:8</w:t>
-            </w:r>
-          </w:p>
-          <w:p>
-            <w:r>
               <w:t>Ephesians 4:18</w:t>
             </w:r>
           </w:p>
@@ -12342,7 +12304,6 @@
                 <w:b/>
                 <w:bCs/>
               </w:rPr>
-              <w:lastRenderedPageBreak/>
               <w:t xml:space="preserve">love </w:t>
             </w:r>
           </w:p>
@@ -12382,6 +12343,7 @@
               </w:numPr>
             </w:pPr>
             <w:r>
+              <w:lastRenderedPageBreak/>
               <w:t>To love like God does, caring for people regardless of what they do. This includes forgiving them and sacrificing for them.</w:t>
             </w:r>
           </w:p>
@@ -12393,6 +12355,7 @@
           </w:tcPr>
           <w:p>
             <w:r>
+              <w:lastRenderedPageBreak/>
               <w:t xml:space="preserve">Matthew 5:46 </w:t>
             </w:r>
           </w:p>
@@ -12413,6 +12376,7 @@
           </w:p>
           <w:p>
             <w:r>
+              <w:lastRenderedPageBreak/>
               <w:t>Romans 8:28</w:t>
             </w:r>
           </w:p>
@@ -12488,6 +12452,7 @@
                 <w:b/>
                 <w:bCs/>
               </w:rPr>
+              <w:lastRenderedPageBreak/>
               <w:t xml:space="preserve">mediator </w:t>
             </w:r>
           </w:p>
@@ -12760,7 +12725,6 @@
               <w:pStyle w:val="Compact"/>
             </w:pPr>
             <w:r>
-              <w:lastRenderedPageBreak/>
               <w:t xml:space="preserve">2 John 1:3  </w:t>
             </w:r>
           </w:p>
@@ -13227,7 +13191,6 @@
               </w:numPr>
             </w:pPr>
             <w:r>
-              <w:lastRenderedPageBreak/>
               <w:t>To do what is required or commanded.</w:t>
             </w:r>
           </w:p>
@@ -13259,48 +13222,47 @@
               <w:pStyle w:val="Compact"/>
             </w:pPr>
             <w:r>
+              <w:t xml:space="preserve">Matthew 8:27 </w:t>
+            </w:r>
+          </w:p>
+          <w:p>
+            <w:pPr>
+              <w:pStyle w:val="Compact"/>
+            </w:pPr>
+            <w:r>
+              <w:t xml:space="preserve">Mark 1:27 </w:t>
+            </w:r>
+          </w:p>
+          <w:p>
+            <w:pPr>
+              <w:pStyle w:val="Compact"/>
+            </w:pPr>
+            <w:r>
+              <w:t>Luke 8:25</w:t>
+            </w:r>
+          </w:p>
+          <w:p>
+            <w:pPr>
+              <w:pStyle w:val="Compact"/>
+            </w:pPr>
+            <w:r>
+              <w:t xml:space="preserve">Luke 17:6 </w:t>
+            </w:r>
+          </w:p>
+          <w:p>
+            <w:pPr>
+              <w:pStyle w:val="Compact"/>
+            </w:pPr>
+            <w:r>
+              <w:t xml:space="preserve">Romans 6:16 </w:t>
+            </w:r>
+          </w:p>
+          <w:p>
+            <w:pPr>
+              <w:pStyle w:val="Compact"/>
+            </w:pPr>
+            <w:r>
               <w:lastRenderedPageBreak/>
-              <w:t xml:space="preserve">Matthew 8:27 </w:t>
-            </w:r>
-          </w:p>
-          <w:p>
-            <w:pPr>
-              <w:pStyle w:val="Compact"/>
-            </w:pPr>
-            <w:r>
-              <w:t xml:space="preserve">Mark 1:27 </w:t>
-            </w:r>
-          </w:p>
-          <w:p>
-            <w:pPr>
-              <w:pStyle w:val="Compact"/>
-            </w:pPr>
-            <w:r>
-              <w:t>Luke 8:25</w:t>
-            </w:r>
-          </w:p>
-          <w:p>
-            <w:pPr>
-              <w:pStyle w:val="Compact"/>
-            </w:pPr>
-            <w:r>
-              <w:lastRenderedPageBreak/>
-              <w:t xml:space="preserve">Luke 17:6 </w:t>
-            </w:r>
-          </w:p>
-          <w:p>
-            <w:pPr>
-              <w:pStyle w:val="Compact"/>
-            </w:pPr>
-            <w:r>
-              <w:t xml:space="preserve">Romans 6:16 </w:t>
-            </w:r>
-          </w:p>
-          <w:p>
-            <w:pPr>
-              <w:pStyle w:val="Compact"/>
-            </w:pPr>
-            <w:r>
               <w:t xml:space="preserve">Romans 10:16 </w:t>
             </w:r>
           </w:p>
@@ -13579,6 +13541,9 @@
             <w:r>
               <w:t>2 Timothy 2:2</w:t>
             </w:r>
+            <w:r>
+              <w:t>2</w:t>
+            </w:r>
           </w:p>
           <w:p>
             <w:pPr>
@@ -13706,23 +13671,23 @@
               <w:pStyle w:val="Compact"/>
             </w:pPr>
             <w:r>
+              <w:t xml:space="preserve">1 Corinthians 11:2 </w:t>
+            </w:r>
+          </w:p>
+          <w:p>
+            <w:pPr>
+              <w:pStyle w:val="Compact"/>
+            </w:pPr>
+            <w:r>
+              <w:t xml:space="preserve">1 Corinthians 11:22 </w:t>
+            </w:r>
+          </w:p>
+          <w:p>
+            <w:pPr>
+              <w:pStyle w:val="Compact"/>
+            </w:pPr>
+            <w:r>
               <w:lastRenderedPageBreak/>
-              <w:t xml:space="preserve">1 Corinthians 11:2 </w:t>
-            </w:r>
-          </w:p>
-          <w:p>
-            <w:pPr>
-              <w:pStyle w:val="Compact"/>
-            </w:pPr>
-            <w:r>
-              <w:t xml:space="preserve">1 Corinthians 11:22 </w:t>
-            </w:r>
-          </w:p>
-          <w:p>
-            <w:pPr>
-              <w:pStyle w:val="Compact"/>
-            </w:pPr>
-            <w:r>
               <w:t xml:space="preserve">2 Corinthians 8:18 </w:t>
             </w:r>
           </w:p>
@@ -14093,7 +14058,6 @@
           <w:p/>
           <w:p>
             <w:r>
-              <w:lastRenderedPageBreak/>
               <w:t xml:space="preserve">The New Testament mostly talks about God’s promises to people. </w:t>
             </w:r>
           </w:p>
@@ -14107,88 +14071,87 @@
               <w:pStyle w:val="Compact"/>
             </w:pPr>
             <w:r>
+              <w:t xml:space="preserve">Luke 24:49 </w:t>
+            </w:r>
+          </w:p>
+          <w:p>
+            <w:pPr>
+              <w:pStyle w:val="Compact"/>
+            </w:pPr>
+            <w:r>
+              <w:t xml:space="preserve">Acts 1:4 </w:t>
+            </w:r>
+          </w:p>
+          <w:p>
+            <w:pPr>
+              <w:pStyle w:val="Compact"/>
+            </w:pPr>
+            <w:r>
+              <w:t xml:space="preserve">Acts 13:23 </w:t>
+            </w:r>
+          </w:p>
+          <w:p>
+            <w:pPr>
+              <w:pStyle w:val="Compact"/>
+            </w:pPr>
+            <w:r>
+              <w:t xml:space="preserve">Romans 4:16 </w:t>
+            </w:r>
+          </w:p>
+          <w:p>
+            <w:pPr>
+              <w:pStyle w:val="Compact"/>
+            </w:pPr>
+            <w:r>
+              <w:t xml:space="preserve">2 Corinthians 7:1 </w:t>
+            </w:r>
+          </w:p>
+          <w:p>
+            <w:pPr>
+              <w:pStyle w:val="Compact"/>
+            </w:pPr>
+            <w:r>
+              <w:t>Galatians 4:28</w:t>
+            </w:r>
+          </w:p>
+          <w:p>
+            <w:pPr>
+              <w:pStyle w:val="Compact"/>
+            </w:pPr>
+            <w:r>
+              <w:t>Ephesians 1:13</w:t>
+            </w:r>
+          </w:p>
+          <w:p>
+            <w:pPr>
+              <w:pStyle w:val="Compact"/>
+            </w:pPr>
+            <w:r>
+              <w:t xml:space="preserve">Ephesians 3:6 </w:t>
+            </w:r>
+          </w:p>
+          <w:p>
+            <w:pPr>
+              <w:pStyle w:val="Compact"/>
+            </w:pPr>
+            <w:r>
+              <w:t xml:space="preserve">1 Timothy 4:8 </w:t>
+            </w:r>
+          </w:p>
+          <w:p>
+            <w:pPr>
+              <w:pStyle w:val="Compact"/>
+            </w:pPr>
+            <w:r>
+              <w:t xml:space="preserve">2 Timothy 1:1 </w:t>
+            </w:r>
+          </w:p>
+          <w:p>
+            <w:pPr>
+              <w:pStyle w:val="Compact"/>
+            </w:pPr>
+            <w:r>
               <w:lastRenderedPageBreak/>
-              <w:t xml:space="preserve">Luke 24:49 </w:t>
-            </w:r>
-          </w:p>
-          <w:p>
-            <w:pPr>
-              <w:pStyle w:val="Compact"/>
-            </w:pPr>
-            <w:r>
-              <w:t xml:space="preserve">Acts 1:4 </w:t>
-            </w:r>
-          </w:p>
-          <w:p>
-            <w:pPr>
-              <w:pStyle w:val="Compact"/>
-            </w:pPr>
-            <w:r>
-              <w:t xml:space="preserve">Acts 13:23 </w:t>
-            </w:r>
-          </w:p>
-          <w:p>
-            <w:pPr>
-              <w:pStyle w:val="Compact"/>
-            </w:pPr>
-            <w:r>
-              <w:t xml:space="preserve">Romans 4:16 </w:t>
-            </w:r>
-          </w:p>
-          <w:p>
-            <w:pPr>
-              <w:pStyle w:val="Compact"/>
-            </w:pPr>
-            <w:r>
-              <w:t xml:space="preserve">2 Corinthians 7:1 </w:t>
-            </w:r>
-          </w:p>
-          <w:p>
-            <w:pPr>
-              <w:pStyle w:val="Compact"/>
-            </w:pPr>
-            <w:r>
-              <w:t>Galatians 4:28</w:t>
-            </w:r>
-          </w:p>
-          <w:p>
-            <w:pPr>
-              <w:pStyle w:val="Compact"/>
-            </w:pPr>
-            <w:r>
-              <w:t>Ephesians 1:13</w:t>
-            </w:r>
-          </w:p>
-          <w:p>
-            <w:pPr>
-              <w:pStyle w:val="Compact"/>
-            </w:pPr>
-            <w:r>
-              <w:t xml:space="preserve">Ephesians 3:6 </w:t>
-            </w:r>
-          </w:p>
-          <w:p>
-            <w:pPr>
-              <w:pStyle w:val="Compact"/>
-            </w:pPr>
-            <w:r>
-              <w:lastRenderedPageBreak/>
-              <w:t xml:space="preserve">1 Timothy 4:8 </w:t>
-            </w:r>
-          </w:p>
-          <w:p>
-            <w:pPr>
-              <w:pStyle w:val="Compact"/>
-            </w:pPr>
-            <w:r>
-              <w:t xml:space="preserve">2 Timothy 1:1 </w:t>
-            </w:r>
-          </w:p>
-          <w:p>
-            <w:pPr>
-              <w:pStyle w:val="Compact"/>
-            </w:pPr>
-            <w:r>
               <w:t xml:space="preserve">Hebrews 6:12 </w:t>
             </w:r>
           </w:p>
@@ -14613,7 +14576,6 @@
                 <w:b/>
                 <w:bCs/>
               </w:rPr>
-              <w:lastRenderedPageBreak/>
               <w:t>redemption</w:t>
             </w:r>
           </w:p>
@@ -14682,6 +14644,7 @@
               <w:pStyle w:val="Compact"/>
             </w:pPr>
             <w:r>
+              <w:lastRenderedPageBreak/>
               <w:t xml:space="preserve">1 Corinthians 1:30 </w:t>
             </w:r>
           </w:p>
@@ -14747,6 +14710,7 @@
                 <w:b/>
                 <w:bCs/>
               </w:rPr>
+              <w:lastRenderedPageBreak/>
               <w:t>repent</w:t>
             </w:r>
           </w:p>
@@ -15012,102 +14976,101 @@
               <w:pStyle w:val="Compact"/>
             </w:pPr>
             <w:r>
+              <w:t xml:space="preserve">Matthew 27:53 </w:t>
+            </w:r>
+          </w:p>
+          <w:p>
+            <w:pPr>
+              <w:pStyle w:val="Compact"/>
+            </w:pPr>
+            <w:r>
+              <w:t xml:space="preserve">Mark 12:18 </w:t>
+            </w:r>
+          </w:p>
+          <w:p>
+            <w:pPr>
+              <w:pStyle w:val="Compact"/>
+            </w:pPr>
+            <w:r>
+              <w:t>Luke 14:14</w:t>
+            </w:r>
+          </w:p>
+          <w:p>
+            <w:pPr>
+              <w:pStyle w:val="Compact"/>
+            </w:pPr>
+            <w:r>
+              <w:t>Luke 20:35</w:t>
+            </w:r>
+            <w:r>
+              <w:t xml:space="preserve"> </w:t>
+            </w:r>
+          </w:p>
+          <w:p>
+            <w:pPr>
+              <w:pStyle w:val="Compact"/>
+            </w:pPr>
+            <w:r>
+              <w:t xml:space="preserve">John 11:25 </w:t>
+            </w:r>
+          </w:p>
+          <w:p>
+            <w:pPr>
+              <w:pStyle w:val="Compact"/>
+            </w:pPr>
+            <w:r>
+              <w:t xml:space="preserve">Acts 4:33 </w:t>
+            </w:r>
+          </w:p>
+          <w:p>
+            <w:pPr>
+              <w:pStyle w:val="Compact"/>
+            </w:pPr>
+            <w:r>
+              <w:t>Acts 24:15</w:t>
+            </w:r>
+            <w:r>
+              <w:t xml:space="preserve"> </w:t>
+            </w:r>
+          </w:p>
+          <w:p>
+            <w:pPr>
+              <w:pStyle w:val="Compact"/>
+            </w:pPr>
+            <w:r>
+              <w:t xml:space="preserve">Romans 1:4 </w:t>
+            </w:r>
+          </w:p>
+          <w:p>
+            <w:pPr>
+              <w:pStyle w:val="Compact"/>
+            </w:pPr>
+            <w:r>
+              <w:t xml:space="preserve">Romans 6:5 </w:t>
+            </w:r>
+          </w:p>
+          <w:p>
+            <w:pPr>
+              <w:pStyle w:val="Compact"/>
+            </w:pPr>
+            <w:r>
+              <w:t xml:space="preserve">1 Corinthians 15:42 </w:t>
+            </w:r>
+          </w:p>
+          <w:p>
+            <w:pPr>
+              <w:pStyle w:val="Compact"/>
+            </w:pPr>
+            <w:r>
+              <w:t xml:space="preserve">Philippians 3:10 </w:t>
+            </w:r>
+          </w:p>
+          <w:p>
+            <w:pPr>
+              <w:pStyle w:val="Compact"/>
+            </w:pPr>
+            <w:r>
               <w:lastRenderedPageBreak/>
-              <w:t xml:space="preserve">Matthew 27:53 </w:t>
-            </w:r>
-          </w:p>
-          <w:p>
-            <w:pPr>
-              <w:pStyle w:val="Compact"/>
-            </w:pPr>
-            <w:r>
-              <w:t xml:space="preserve">Mark 12:18 </w:t>
-            </w:r>
-          </w:p>
-          <w:p>
-            <w:pPr>
-              <w:pStyle w:val="Compact"/>
-            </w:pPr>
-            <w:r>
-              <w:t>Luke 14:14</w:t>
-            </w:r>
-          </w:p>
-          <w:p>
-            <w:pPr>
-              <w:pStyle w:val="Compact"/>
-            </w:pPr>
-            <w:r>
-              <w:t>Luke 20:35</w:t>
-            </w:r>
-            <w:r>
-              <w:t xml:space="preserve"> </w:t>
-            </w:r>
-          </w:p>
-          <w:p>
-            <w:pPr>
-              <w:pStyle w:val="Compact"/>
-            </w:pPr>
-            <w:r>
-              <w:t xml:space="preserve">John 11:25 </w:t>
-            </w:r>
-          </w:p>
-          <w:p>
-            <w:pPr>
-              <w:pStyle w:val="Compact"/>
-            </w:pPr>
-            <w:r>
-              <w:t xml:space="preserve">Acts 4:33 </w:t>
-            </w:r>
-          </w:p>
-          <w:p>
-            <w:pPr>
-              <w:pStyle w:val="Compact"/>
-            </w:pPr>
-            <w:r>
-              <w:lastRenderedPageBreak/>
-              <w:t>Acts 24:15</w:t>
-            </w:r>
-            <w:r>
-              <w:t xml:space="preserve"> </w:t>
-            </w:r>
-          </w:p>
-          <w:p>
-            <w:pPr>
-              <w:pStyle w:val="Compact"/>
-            </w:pPr>
-            <w:r>
-              <w:t xml:space="preserve">Romans 1:4 </w:t>
-            </w:r>
-          </w:p>
-          <w:p>
-            <w:pPr>
-              <w:pStyle w:val="Compact"/>
-            </w:pPr>
-            <w:r>
-              <w:t xml:space="preserve">Romans 6:5 </w:t>
-            </w:r>
-          </w:p>
-          <w:p>
-            <w:pPr>
-              <w:pStyle w:val="Compact"/>
-            </w:pPr>
-            <w:r>
-              <w:t xml:space="preserve">1 Corinthians 15:42 </w:t>
-            </w:r>
-          </w:p>
-          <w:p>
-            <w:pPr>
-              <w:pStyle w:val="Compact"/>
-            </w:pPr>
-            <w:r>
-              <w:t xml:space="preserve">Philippians 3:10 </w:t>
-            </w:r>
-          </w:p>
-          <w:p>
-            <w:pPr>
-              <w:pStyle w:val="Compact"/>
-            </w:pPr>
-            <w:r>
               <w:t xml:space="preserve">Hebrews 11:35 </w:t>
             </w:r>
           </w:p>
@@ -15504,7 +15467,6 @@
               <w:pStyle w:val="Compact"/>
             </w:pPr>
             <w:r>
-              <w:lastRenderedPageBreak/>
               <w:t>Hebrews 13:15</w:t>
             </w:r>
           </w:p>
@@ -15958,7 +15920,6 @@
                 <w:b/>
                 <w:bCs/>
               </w:rPr>
-              <w:lastRenderedPageBreak/>
               <w:t>save</w:t>
             </w:r>
           </w:p>
@@ -16064,6 +16025,7 @@
               <w:pStyle w:val="Compact"/>
             </w:pPr>
             <w:r>
+              <w:lastRenderedPageBreak/>
               <w:t xml:space="preserve">1 Corinthians 1:18 </w:t>
             </w:r>
           </w:p>
@@ -16153,6 +16115,7 @@
                 <w:b/>
                 <w:bCs/>
               </w:rPr>
+              <w:lastRenderedPageBreak/>
               <w:t xml:space="preserve">scriptures </w:t>
             </w:r>
           </w:p>
@@ -16352,7 +16315,6 @@
                 <w:b/>
                 <w:bCs/>
               </w:rPr>
-              <w:lastRenderedPageBreak/>
               <w:t>shame</w:t>
             </w:r>
           </w:p>
@@ -16493,6 +16455,7 @@
                 <w:b/>
                 <w:bCs/>
               </w:rPr>
+              <w:lastRenderedPageBreak/>
               <w:t xml:space="preserve">sheep </w:t>
             </w:r>
           </w:p>
@@ -16821,7 +16784,6 @@
               <w:pStyle w:val="Compact"/>
             </w:pPr>
             <w:r>
-              <w:lastRenderedPageBreak/>
               <w:t>Revelation 7:17</w:t>
             </w:r>
             <w:r>
@@ -16850,7 +16812,6 @@
                 <w:b/>
                 <w:bCs/>
               </w:rPr>
-              <w:lastRenderedPageBreak/>
               <w:t>sin</w:t>
             </w:r>
           </w:p>
@@ -16953,6 +16914,7 @@
           </w:p>
           <w:p>
             <w:r>
+              <w:lastRenderedPageBreak/>
               <w:t>Colossians 1:14</w:t>
             </w:r>
           </w:p>
@@ -17005,6 +16967,7 @@
                 <w:b/>
                 <w:bCs/>
               </w:rPr>
+              <w:lastRenderedPageBreak/>
               <w:t xml:space="preserve">Son of God </w:t>
             </w:r>
           </w:p>
@@ -17183,52 +17146,52 @@
           </w:p>
           <w:p>
             <w:r>
+              <w:t xml:space="preserve">Mark 10:33 </w:t>
+            </w:r>
+          </w:p>
+          <w:p>
+            <w:r>
+              <w:t xml:space="preserve">Mark 13:26 </w:t>
+            </w:r>
+          </w:p>
+          <w:p>
+            <w:r>
+              <w:t xml:space="preserve">Luke 7:34 </w:t>
+            </w:r>
+          </w:p>
+          <w:p>
+            <w:r>
+              <w:t xml:space="preserve">Luke 19:10 </w:t>
+            </w:r>
+          </w:p>
+          <w:p>
+            <w:r>
+              <w:t xml:space="preserve">Luke 22:48 </w:t>
+            </w:r>
+          </w:p>
+          <w:p>
+            <w:r>
+              <w:t>John 3:14</w:t>
+            </w:r>
+          </w:p>
+          <w:p>
+            <w:r>
+              <w:t>John 12:34</w:t>
+            </w:r>
+          </w:p>
+          <w:p>
+            <w:r>
+              <w:t>Acts 7:56</w:t>
+            </w:r>
+          </w:p>
+          <w:p>
+            <w:r>
+              <w:t>Revelation 1:13</w:t>
+            </w:r>
+          </w:p>
+          <w:p>
+            <w:r>
               <w:lastRenderedPageBreak/>
-              <w:t xml:space="preserve">Mark 10:33 </w:t>
-            </w:r>
-          </w:p>
-          <w:p>
-            <w:r>
-              <w:t xml:space="preserve">Mark 13:26 </w:t>
-            </w:r>
-          </w:p>
-          <w:p>
-            <w:r>
-              <w:t xml:space="preserve">Luke 7:34 </w:t>
-            </w:r>
-          </w:p>
-          <w:p>
-            <w:r>
-              <w:t xml:space="preserve">Luke 19:10 </w:t>
-            </w:r>
-          </w:p>
-          <w:p>
-            <w:r>
-              <w:t xml:space="preserve">Luke 22:48 </w:t>
-            </w:r>
-          </w:p>
-          <w:p>
-            <w:r>
-              <w:t>John 3:14</w:t>
-            </w:r>
-          </w:p>
-          <w:p>
-            <w:r>
-              <w:t>John 12:34</w:t>
-            </w:r>
-          </w:p>
-          <w:p>
-            <w:r>
-              <w:t>Acts 7:56</w:t>
-            </w:r>
-          </w:p>
-          <w:p>
-            <w:r>
-              <w:t>Revelation 1:13</w:t>
-            </w:r>
-          </w:p>
-          <w:p>
-            <w:r>
               <w:t>Revelation 14:14</w:t>
             </w:r>
           </w:p>
@@ -17575,7 +17538,6 @@
           </w:p>
           <w:p>
             <w:r>
-              <w:lastRenderedPageBreak/>
               <w:t xml:space="preserve">Colossians 2:5 </w:t>
             </w:r>
           </w:p>
@@ -18009,7 +17971,6 @@
                 <w:b/>
                 <w:bCs/>
               </w:rPr>
-              <w:lastRenderedPageBreak/>
               <w:t>tree</w:t>
             </w:r>
             <w:r>
@@ -18032,7 +17993,11 @@
               <w:t xml:space="preserve">      </w:t>
             </w:r>
             <w:r>
-              <w:t>A cross was an upright wooden post stuck into the ground with a wooden beam going across it near the top. During the time of the Roman Empire, the Roman government killed criminals by tying or nailing them to a cross and leaving them there to die.</w:t>
+              <w:t xml:space="preserve">A cross was an upright wooden post stuck into the ground with a wooden beam going across it near the top. During the time of the Roman Empire, the Roman </w:t>
+            </w:r>
+            <w:r>
+              <w:lastRenderedPageBreak/>
+              <w:t>government killed criminals by tying or nailing them to a cross and leaving them there to die.</w:t>
             </w:r>
           </w:p>
         </w:tc>
@@ -18042,6 +18007,7 @@
           </w:tcPr>
           <w:p>
             <w:r>
+              <w:lastRenderedPageBreak/>
               <w:t>Acts 5:30</w:t>
             </w:r>
           </w:p>
@@ -18487,7 +18453,6 @@
                 <w:b/>
                 <w:bCs/>
               </w:rPr>
-              <w:lastRenderedPageBreak/>
               <w:t>will (of God)</w:t>
             </w:r>
           </w:p>
@@ -18546,6 +18511,7 @@
               </w:numPr>
             </w:pPr>
             <w:r>
+              <w:lastRenderedPageBreak/>
               <w:t>What is pleasing to God.</w:t>
             </w:r>
           </w:p>
@@ -18568,6 +18534,7 @@
           </w:tcPr>
           <w:p>
             <w:r>
+              <w:lastRenderedPageBreak/>
               <w:t xml:space="preserve">Matthew 6:10 </w:t>
             </w:r>
           </w:p>
@@ -18588,6 +18555,7 @@
           </w:p>
           <w:p>
             <w:r>
+              <w:lastRenderedPageBreak/>
               <w:t>Romans 12:2</w:t>
             </w:r>
           </w:p>
@@ -18666,6 +18634,7 @@
                 <w:b/>
                 <w:bCs/>
               </w:rPr>
+              <w:lastRenderedPageBreak/>
               <w:t>wisdom</w:t>
             </w:r>
           </w:p>
@@ -18955,7 +18924,6 @@
           <w:p/>
           <w:p>
             <w:r>
-              <w:lastRenderedPageBreak/>
               <w:t xml:space="preserve">Only God is completely wise. </w:t>
             </w:r>
           </w:p>
@@ -18970,7 +18938,6 @@
               <w:pStyle w:val="Compact"/>
             </w:pPr>
             <w:r>
-              <w:lastRenderedPageBreak/>
               <w:t xml:space="preserve">Matthew 7:24 </w:t>
             </w:r>
           </w:p>
@@ -19003,7 +18970,6 @@
               <w:pStyle w:val="Compact"/>
             </w:pPr>
             <w:r>
-              <w:lastRenderedPageBreak/>
               <w:t xml:space="preserve">Romans 12:16 </w:t>
             </w:r>
           </w:p>
@@ -19414,7 +19380,6 @@
               <w:pStyle w:val="Compact"/>
             </w:pPr>
             <w:r>
-              <w:lastRenderedPageBreak/>
               <w:t xml:space="preserve">Revelation 22:9 </w:t>
             </w:r>
           </w:p>

</xml_diff>

<commit_message>
Updated stet_en.docx per TS request Remove Luke 11:4 reference wrt evil word entry
</commit_message>
<xml_diff>
--- a/backend/document/stet/data/stet_en.docx
+++ b/backend/document/stet/data/stet_en.docx
@@ -1,6 +1,6 @@
 
 <file path=word/document.xml><?xml version="1.0" encoding="utf-8"?>
-<w:document xmlns:wpc="http://schemas.microsoft.com/office/word/2010/wordprocessingCanvas" xmlns:cx="http://schemas.microsoft.com/office/drawing/2014/chartex" xmlns:cx1="http://schemas.microsoft.com/office/drawing/2015/9/8/chartex" xmlns:cx2="http://schemas.microsoft.com/office/drawing/2015/10/21/chartex" xmlns:cx3="http://schemas.microsoft.com/office/drawing/2016/5/9/chartex" xmlns:cx4="http://schemas.microsoft.com/office/drawing/2016/5/10/chartex" xmlns:cx5="http://schemas.microsoft.com/office/drawing/2016/5/11/chartex" xmlns:cx6="http://schemas.microsoft.com/office/drawing/2016/5/12/chartex" xmlns:cx7="http://schemas.microsoft.com/office/drawing/2016/5/13/chartex" xmlns:cx8="http://schemas.microsoft.com/office/drawing/2016/5/14/chartex" xmlns:mc="http://schemas.openxmlformats.org/markup-compatibility/2006" xmlns:aink="http://schemas.microsoft.com/office/drawing/2016/ink" xmlns:am3d="http://schemas.microsoft.com/office/drawing/2017/model3d" xmlns:o="urn:schemas-microsoft-com:office:office" xmlns:oel="http://schemas.microsoft.com/office/2019/extlst" xmlns:r="http://schemas.openxmlformats.org/officeDocument/2006/relationships" xmlns:m="http://schemas.openxmlformats.org/officeDocument/2006/math" xmlns:v="urn:schemas-microsoft-com:vml" xmlns:wp14="http://schemas.microsoft.com/office/word/2010/wordprocessingDrawing" xmlns:wp="http://schemas.openxmlformats.org/drawingml/2006/wordprocessingDrawing" xmlns:w10="urn:schemas-microsoft-com:office:word" xmlns:w="http://schemas.openxmlformats.org/wordprocessingml/2006/main" xmlns:w14="http://schemas.microsoft.com/office/word/2010/wordml" xmlns:w15="http://schemas.microsoft.com/office/word/2012/wordml" xmlns:w16cex="http://schemas.microsoft.com/office/word/2018/wordml/cex" xmlns:w16cid="http://schemas.microsoft.com/office/word/2016/wordml/cid" xmlns:w16="http://schemas.microsoft.com/office/word/2018/wordml" xmlns:w16du="http://schemas.microsoft.com/office/word/2023/wordml/word16du" xmlns:w16sdtdh="http://schemas.microsoft.com/office/word/2020/wordml/sdtdatahash" xmlns:w16se="http://schemas.microsoft.com/office/word/2015/wordml/symex" xmlns:wpg="http://schemas.microsoft.com/office/word/2010/wordprocessingGroup" xmlns:wpi="http://schemas.microsoft.com/office/word/2010/wordprocessingInk" xmlns:wne="http://schemas.microsoft.com/office/word/2006/wordml" xmlns:wps="http://schemas.microsoft.com/office/word/2010/wordprocessingShape" mc:Ignorable="w14 w15 w16se w16cid w16 w16cex w16sdtdh w16du wp14">
+<w:document xmlns:wpc="http://schemas.microsoft.com/office/word/2010/wordprocessingCanvas" xmlns:mc="http://schemas.openxmlformats.org/markup-compatibility/2006" xmlns:o="urn:schemas-microsoft-com:office:office" xmlns:r="http://schemas.openxmlformats.org/officeDocument/2006/relationships" xmlns:m="http://schemas.openxmlformats.org/officeDocument/2006/math" xmlns:v="urn:schemas-microsoft-com:vml" xmlns:wp14="http://schemas.microsoft.com/office/word/2010/wordprocessingDrawing" xmlns:wp="http://schemas.openxmlformats.org/drawingml/2006/wordprocessingDrawing" xmlns:w10="urn:schemas-microsoft-com:office:word" xmlns:w="http://schemas.openxmlformats.org/wordprocessingml/2006/main" xmlns:w14="http://schemas.microsoft.com/office/word/2010/wordml" xmlns:w15="http://schemas.microsoft.com/office/word/2012/wordml" xmlns:wpg="http://schemas.microsoft.com/office/word/2010/wordprocessingGroup" xmlns:wpi="http://schemas.microsoft.com/office/word/2010/wordprocessingInk" xmlns:wne="http://schemas.microsoft.com/office/word/2006/wordml" xmlns:wps="http://schemas.microsoft.com/office/word/2010/wordprocessingShape" mc:Ignorable="w14 w15 wp14">
   <w:body>
     <w:tbl>
       <w:tblPr>
@@ -1006,17 +1006,17 @@
           </w:p>
           <w:p>
             <w:r>
+              <w:t>Romans 13:1</w:t>
+            </w:r>
+          </w:p>
+          <w:p>
+            <w:r>
+              <w:t xml:space="preserve">1 Corinthians 7:4 </w:t>
+            </w:r>
+          </w:p>
+          <w:p>
+            <w:r>
               <w:lastRenderedPageBreak/>
-              <w:t>Romans 13:1</w:t>
-            </w:r>
-          </w:p>
-          <w:p>
-            <w:r>
-              <w:t xml:space="preserve">1 Corinthians 7:4 </w:t>
-            </w:r>
-          </w:p>
-          <w:p>
-            <w:r>
               <w:t>Ephesians 1:21</w:t>
             </w:r>
           </w:p>
@@ -1423,7 +1423,6 @@
                 <w:b/>
                 <w:bCs/>
               </w:rPr>
-              <w:lastRenderedPageBreak/>
               <w:t>b</w:t>
             </w:r>
             <w:r>
@@ -1452,6 +1451,7 @@
           <w:p/>
           <w:p>
             <w:r>
+              <w:lastRenderedPageBreak/>
               <w:t>Note: Verses with * symbols should all use the same meaning of the word.</w:t>
             </w:r>
           </w:p>
@@ -1462,6 +1462,7 @@
           </w:tcPr>
           <w:p>
             <w:r>
+              <w:lastRenderedPageBreak/>
               <w:t>Matthew 3:17</w:t>
             </w:r>
           </w:p>
@@ -1482,6 +1483,7 @@
           </w:p>
           <w:p>
             <w:r>
+              <w:lastRenderedPageBreak/>
               <w:t>Romans 1:7</w:t>
             </w:r>
           </w:p>
@@ -1574,6 +1576,7 @@
                 <w:b/>
                 <w:bCs/>
               </w:rPr>
+              <w:lastRenderedPageBreak/>
               <w:t>b</w:t>
             </w:r>
             <w:r>
@@ -1817,7 +1820,6 @@
           </w:p>
           <w:p>
             <w:r>
-              <w:lastRenderedPageBreak/>
               <w:t>Revelation 17:3</w:t>
             </w:r>
           </w:p>
@@ -2638,25 +2640,25 @@
           </w:p>
           <w:p>
             <w:r>
+              <w:t>Acts 2:31</w:t>
+            </w:r>
+          </w:p>
+          <w:p>
+            <w:r>
+              <w:t>Romans 3:24</w:t>
+            </w:r>
+          </w:p>
+          <w:p>
+            <w:r>
+              <w:t>Romans 5:6</w:t>
+            </w:r>
+            <w:r>
+              <w:t xml:space="preserve"> </w:t>
+            </w:r>
+          </w:p>
+          <w:p>
+            <w:r>
               <w:lastRenderedPageBreak/>
-              <w:t>Acts 2:31</w:t>
-            </w:r>
-          </w:p>
-          <w:p>
-            <w:r>
-              <w:t>Romans 3:24</w:t>
-            </w:r>
-          </w:p>
-          <w:p>
-            <w:r>
-              <w:t>Romans 5:6</w:t>
-            </w:r>
-            <w:r>
-              <w:t xml:space="preserve"> </w:t>
-            </w:r>
-          </w:p>
-          <w:p>
-            <w:r>
               <w:t>Romans 5:</w:t>
             </w:r>
             <w:r>
@@ -3039,7 +3041,6 @@
                 <w:b/>
                 <w:bCs/>
               </w:rPr>
-              <w:lastRenderedPageBreak/>
               <w:t>c</w:t>
             </w:r>
             <w:r>
@@ -3172,6 +3173,7 @@
               <w:pStyle w:val="Compact"/>
             </w:pPr>
             <w:r>
+              <w:lastRenderedPageBreak/>
               <w:t xml:space="preserve">Mark 6:34 </w:t>
             </w:r>
           </w:p>
@@ -3245,6 +3247,7 @@
                 <w:b/>
                 <w:bCs/>
               </w:rPr>
+              <w:lastRenderedPageBreak/>
               <w:t>c</w:t>
             </w:r>
             <w:r>
@@ -3573,7 +3576,6 @@
               </w:numPr>
             </w:pPr>
             <w:r>
-              <w:lastRenderedPageBreak/>
               <w:t>T</w:t>
             </w:r>
             <w:r>
@@ -3608,85 +3610,84 @@
           </w:tcPr>
           <w:p>
             <w:r>
+              <w:t>Matthew 3:6</w:t>
+            </w:r>
+          </w:p>
+          <w:p>
+            <w:r>
+              <w:t>Mark 1:5</w:t>
+            </w:r>
+          </w:p>
+          <w:p>
+            <w:r>
+              <w:t>Luke 12:8</w:t>
+            </w:r>
+          </w:p>
+          <w:p>
+            <w:r>
+              <w:t xml:space="preserve">John 1:20 </w:t>
+            </w:r>
+          </w:p>
+          <w:p>
+            <w:r>
+              <w:t>Acts 19:18</w:t>
+            </w:r>
+          </w:p>
+          <w:p>
+            <w:r>
+              <w:t>Romans 10:9</w:t>
+            </w:r>
+          </w:p>
+          <w:p>
+            <w:r>
+              <w:t>Romans 10:</w:t>
+            </w:r>
+            <w:r>
+              <w:t>10</w:t>
+            </w:r>
+          </w:p>
+          <w:p>
+            <w:r>
+              <w:t>Romans 14:11</w:t>
+            </w:r>
+          </w:p>
+          <w:p>
+            <w:r>
+              <w:t>Philippians 2:11</w:t>
+            </w:r>
+          </w:p>
+          <w:p>
+            <w:r>
+              <w:t>1 Timothy 6:12</w:t>
+            </w:r>
+            <w:r>
+              <w:t xml:space="preserve"> (*)</w:t>
+            </w:r>
+          </w:p>
+          <w:p>
+            <w:r>
+              <w:t>1 Timothy 6:</w:t>
+            </w:r>
+            <w:r>
+              <w:t>13</w:t>
+            </w:r>
+            <w:r>
+              <w:t xml:space="preserve"> (*)</w:t>
+            </w:r>
+          </w:p>
+          <w:p>
+            <w:r>
+              <w:t>Hebrews 4:14</w:t>
+            </w:r>
+          </w:p>
+          <w:p>
+            <w:r>
+              <w:t>James 5:16</w:t>
+            </w:r>
+          </w:p>
+          <w:p>
+            <w:r>
               <w:lastRenderedPageBreak/>
-              <w:t>Matthew 3:6</w:t>
-            </w:r>
-          </w:p>
-          <w:p>
-            <w:r>
-              <w:t>Mark 1:5</w:t>
-            </w:r>
-          </w:p>
-          <w:p>
-            <w:r>
-              <w:t>Luke 12:8</w:t>
-            </w:r>
-          </w:p>
-          <w:p>
-            <w:r>
-              <w:t xml:space="preserve">John 1:20 </w:t>
-            </w:r>
-          </w:p>
-          <w:p>
-            <w:r>
-              <w:t>Acts 19:18</w:t>
-            </w:r>
-          </w:p>
-          <w:p>
-            <w:r>
-              <w:lastRenderedPageBreak/>
-              <w:t>Romans 10:9</w:t>
-            </w:r>
-          </w:p>
-          <w:p>
-            <w:r>
-              <w:t>Romans 10:</w:t>
-            </w:r>
-            <w:r>
-              <w:t>10</w:t>
-            </w:r>
-          </w:p>
-          <w:p>
-            <w:r>
-              <w:t>Romans 14:11</w:t>
-            </w:r>
-          </w:p>
-          <w:p>
-            <w:r>
-              <w:t>Philippians 2:11</w:t>
-            </w:r>
-          </w:p>
-          <w:p>
-            <w:r>
-              <w:t>1 Timothy 6:12</w:t>
-            </w:r>
-            <w:r>
-              <w:t xml:space="preserve"> (*)</w:t>
-            </w:r>
-          </w:p>
-          <w:p>
-            <w:r>
-              <w:t>1 Timothy 6:</w:t>
-            </w:r>
-            <w:r>
-              <w:t>13</w:t>
-            </w:r>
-            <w:r>
-              <w:t xml:space="preserve"> (*)</w:t>
-            </w:r>
-          </w:p>
-          <w:p>
-            <w:r>
-              <w:t>Hebrews 4:14</w:t>
-            </w:r>
-          </w:p>
-          <w:p>
-            <w:r>
-              <w:t>James 5:16</w:t>
-            </w:r>
-          </w:p>
-          <w:p>
-            <w:r>
               <w:t>1 John 1:9</w:t>
             </w:r>
           </w:p>
@@ -4017,7 +4018,6 @@
           </w:tcPr>
           <w:p>
             <w:r>
-              <w:lastRenderedPageBreak/>
               <w:t>Matthew 20:19</w:t>
             </w:r>
           </w:p>
@@ -4102,7 +4102,6 @@
           </w:p>
           <w:p>
             <w:r>
-              <w:lastRenderedPageBreak/>
               <w:t>Acts 2:36</w:t>
             </w:r>
           </w:p>
@@ -4527,23 +4526,7 @@
                 <w:rFonts w:asciiTheme="minorHAnsi" w:hAnsiTheme="minorHAnsi" w:cs="Noto Sans"/>
                 <w:color w:val="000000"/>
               </w:rPr>
-              <w:t xml:space="preserve"> </w:t>
-            </w:r>
-            <w:proofErr w:type="gramStart"/>
-            <w:r>
-              <w:rPr>
-                <w:rFonts w:asciiTheme="minorHAnsi" w:hAnsiTheme="minorHAnsi" w:cs="Noto Sans"/>
-                <w:color w:val="000000"/>
-              </w:rPr>
-              <w:t>god</w:t>
-            </w:r>
-            <w:proofErr w:type="gramEnd"/>
-            <w:r>
-              <w:rPr>
-                <w:rFonts w:asciiTheme="minorHAnsi" w:hAnsiTheme="minorHAnsi" w:cs="Noto Sans"/>
-                <w:color w:val="000000"/>
-              </w:rPr>
-              <w:t>, divine power, or deity</w:t>
+              <w:t xml:space="preserve"> god, divine power, or deity</w:t>
             </w:r>
             <w:r>
               <w:rPr>
@@ -4867,7 +4850,6 @@
                 <w:rFonts w:asciiTheme="minorHAnsi" w:hAnsiTheme="minorHAnsi" w:cs="Noto Sans"/>
                 <w:color w:val="000000"/>
               </w:rPr>
-              <w:lastRenderedPageBreak/>
               <w:t>1 Timothy 4:1</w:t>
             </w:r>
           </w:p>
@@ -4958,7 +4940,6 @@
                 <w:b/>
                 <w:bCs/>
               </w:rPr>
-              <w:lastRenderedPageBreak/>
               <w:t>d</w:t>
             </w:r>
             <w:r>
@@ -5108,6 +5089,7 @@
               <w:pStyle w:val="Compact"/>
             </w:pPr>
             <w:r>
+              <w:lastRenderedPageBreak/>
               <w:t xml:space="preserve">1 Corinthians 11:32 </w:t>
             </w:r>
           </w:p>
@@ -5148,6 +5130,7 @@
               <w:pStyle w:val="Compact"/>
             </w:pPr>
             <w:r>
+              <w:lastRenderedPageBreak/>
               <w:t>Hebrews 12:5</w:t>
             </w:r>
             <w:r>
@@ -5275,6 +5258,7 @@
                 <w:b/>
                 <w:bCs/>
               </w:rPr>
+              <w:lastRenderedPageBreak/>
               <w:t>d</w:t>
             </w:r>
             <w:r>
@@ -5477,7 +5461,6 @@
               </w:rPr>
             </w:pPr>
             <w:r>
-              <w:lastRenderedPageBreak/>
               <w:t xml:space="preserve">Note: Verses with * symbols should all use the same </w:t>
             </w:r>
             <w:r>
@@ -5498,7 +5481,6 @@
               <w:pStyle w:val="Compact"/>
             </w:pPr>
             <w:r>
-              <w:lastRenderedPageBreak/>
               <w:t xml:space="preserve">Romans 1:20 </w:t>
             </w:r>
           </w:p>
@@ -5666,6 +5648,7 @@
               <w:pStyle w:val="Compact"/>
             </w:pPr>
             <w:r>
+              <w:lastRenderedPageBreak/>
               <w:t xml:space="preserve">Colossians 3:12 </w:t>
             </w:r>
           </w:p>
@@ -5739,6 +5722,7 @@
                 <w:b/>
                 <w:bCs/>
               </w:rPr>
+              <w:lastRenderedPageBreak/>
               <w:t>e</w:t>
             </w:r>
             <w:r>
@@ -5929,7 +5913,6 @@
               <w:pStyle w:val="Compact"/>
             </w:pPr>
             <w:r>
-              <w:lastRenderedPageBreak/>
               <w:t xml:space="preserve">Revelation 2:3 </w:t>
             </w:r>
           </w:p>
@@ -5955,7 +5938,6 @@
                 <w:b/>
                 <w:bCs/>
               </w:rPr>
-              <w:lastRenderedPageBreak/>
               <w:t>e</w:t>
             </w:r>
             <w:r>
@@ -6143,6 +6125,7 @@
           </w:p>
           <w:p>
             <w:r>
+              <w:lastRenderedPageBreak/>
               <w:t>Hebrews 5:9</w:t>
             </w:r>
           </w:p>
@@ -6173,6 +6156,7 @@
                 <w:b/>
                 <w:bCs/>
               </w:rPr>
+              <w:lastRenderedPageBreak/>
               <w:t>e</w:t>
             </w:r>
             <w:r>
@@ -6286,11 +6270,8 @@
             <w:r>
               <w:t>Luke 6:9</w:t>
             </w:r>
-          </w:p>
-          <w:p>
-            <w:r>
-              <w:t>Luke 11:4</w:t>
-            </w:r>
+            <w:bookmarkStart w:id="0" w:name="_GoBack"/>
+            <w:bookmarkEnd w:id="0"/>
           </w:p>
           <w:p>
             <w:r>
@@ -6383,7 +6364,6 @@
                 <w:b/>
                 <w:bCs/>
               </w:rPr>
-              <w:lastRenderedPageBreak/>
               <w:t>f</w:t>
             </w:r>
             <w:r>
@@ -6594,6 +6574,7 @@
                 <w:b/>
                 <w:bCs/>
               </w:rPr>
+              <w:lastRenderedPageBreak/>
               <w:t>f</w:t>
             </w:r>
             <w:r>
@@ -6847,7 +6828,6 @@
               </w:numPr>
             </w:pPr>
             <w:r>
-              <w:lastRenderedPageBreak/>
               <w:t>An ancestor.</w:t>
             </w:r>
           </w:p>
@@ -6885,7 +6865,6 @@
           </w:tcPr>
           <w:p>
             <w:r>
-              <w:lastRenderedPageBreak/>
               <w:t>Matthew 4:22</w:t>
             </w:r>
           </w:p>
@@ -6909,7 +6888,6 @@
           </w:p>
           <w:p>
             <w:r>
-              <w:lastRenderedPageBreak/>
               <w:t>Luke 2:48</w:t>
             </w:r>
           </w:p>
@@ -7009,7 +6987,6 @@
                 <w:b/>
                 <w:bCs/>
               </w:rPr>
-              <w:lastRenderedPageBreak/>
               <w:t>f</w:t>
             </w:r>
             <w:r>
@@ -7086,6 +7063,7 @@
               </w:numPr>
             </w:pPr>
             <w:r>
+              <w:lastRenderedPageBreak/>
               <w:t>A person or all people.</w:t>
             </w:r>
           </w:p>
@@ -7141,6 +7119,7 @@
           </w:tcPr>
           <w:p>
             <w:r>
+              <w:lastRenderedPageBreak/>
               <w:t xml:space="preserve">Matthew 16:17 </w:t>
             </w:r>
           </w:p>
@@ -7172,6 +7151,7 @@
           </w:p>
           <w:p>
             <w:r>
+              <w:lastRenderedPageBreak/>
               <w:t>Acts 2:17</w:t>
             </w:r>
           </w:p>
@@ -7251,6 +7231,7 @@
                 <w:b/>
                 <w:bCs/>
               </w:rPr>
+              <w:lastRenderedPageBreak/>
               <w:t>f</w:t>
             </w:r>
             <w:r>
@@ -7335,7 +7316,6 @@
               <w:pStyle w:val="Compact"/>
             </w:pPr>
             <w:r>
-              <w:lastRenderedPageBreak/>
               <w:t xml:space="preserve">2 Peter 3:17 </w:t>
             </w:r>
           </w:p>
@@ -7361,7 +7341,6 @@
                 <w:b/>
                 <w:bCs/>
               </w:rPr>
-              <w:lastRenderedPageBreak/>
               <w:t xml:space="preserve">forgive </w:t>
             </w:r>
           </w:p>
@@ -7697,6 +7676,7 @@
               </w:numPr>
             </w:pPr>
             <w:r>
+              <w:lastRenderedPageBreak/>
               <w:t>An occurrence of a previously prophesied event.</w:t>
             </w:r>
           </w:p>
@@ -7731,6 +7711,7 @@
           </w:tcPr>
           <w:p>
             <w:r>
+              <w:lastRenderedPageBreak/>
               <w:t>Matthew 4:14</w:t>
             </w:r>
           </w:p>
@@ -7751,6 +7732,7 @@
           </w:p>
           <w:p>
             <w:r>
+              <w:lastRenderedPageBreak/>
               <w:t>John 17:12</w:t>
             </w:r>
           </w:p>
@@ -8202,6 +8184,7 @@
               <w:pStyle w:val="Compact"/>
             </w:pPr>
             <w:r>
+              <w:lastRenderedPageBreak/>
               <w:t>2 Peter 1:</w:t>
             </w:r>
             <w:r>
@@ -8269,6 +8252,7 @@
                 <w:b/>
                 <w:bCs/>
               </w:rPr>
+              <w:lastRenderedPageBreak/>
               <w:t>g</w:t>
             </w:r>
             <w:r>
@@ -8357,7 +8341,6 @@
               </w:numPr>
             </w:pPr>
             <w:r>
-              <w:lastRenderedPageBreak/>
               <w:t>T</w:t>
             </w:r>
             <w:r>
@@ -8410,7 +8393,6 @@
           </w:tcPr>
           <w:p>
             <w:r>
-              <w:lastRenderedPageBreak/>
               <w:t>Matthew 5:45</w:t>
             </w:r>
           </w:p>
@@ -8455,7 +8437,6 @@
           </w:p>
           <w:p>
             <w:r>
-              <w:lastRenderedPageBreak/>
               <w:t>John 7:12</w:t>
             </w:r>
           </w:p>
@@ -8536,7 +8517,6 @@
                 <w:b/>
                 <w:bCs/>
               </w:rPr>
-              <w:lastRenderedPageBreak/>
               <w:t>Good News</w:t>
             </w:r>
             <w:r>
@@ -8702,6 +8682,7 @@
               </w:numPr>
             </w:pPr>
             <w:r>
+              <w:lastRenderedPageBreak/>
               <w:t>Favor. If people have favor with someone, that person thinks well of them and is pleased with them.</w:t>
             </w:r>
           </w:p>
@@ -8760,6 +8741,7 @@
           </w:tcPr>
           <w:p>
             <w:r>
+              <w:lastRenderedPageBreak/>
               <w:t>Luke 1:</w:t>
             </w:r>
             <w:r>
@@ -8781,6 +8763,7 @@
           </w:p>
           <w:p>
             <w:r>
+              <w:lastRenderedPageBreak/>
               <w:t>Romans 3:24</w:t>
             </w:r>
           </w:p>
@@ -8811,7 +8794,6 @@
           </w:p>
           <w:p>
             <w:r>
-              <w:lastRenderedPageBreak/>
               <w:t>Colossians 4:6</w:t>
             </w:r>
           </w:p>
@@ -9137,6 +9119,7 @@
           <w:p/>
           <w:p>
             <w:r>
+              <w:lastRenderedPageBreak/>
               <w:t xml:space="preserve">When something is </w:t>
             </w:r>
             <w:r>
@@ -9153,6 +9136,7 @@
           </w:tcPr>
           <w:p>
             <w:r>
+              <w:lastRenderedPageBreak/>
               <w:t>Matthew 3:16, 17</w:t>
             </w:r>
           </w:p>
@@ -9215,6 +9199,7 @@
           </w:p>
           <w:p>
             <w:r>
+              <w:lastRenderedPageBreak/>
               <w:t>1 Peter 1:4</w:t>
             </w:r>
           </w:p>
@@ -9723,6 +9708,7 @@
               </w:numPr>
             </w:pPr>
             <w:r>
+              <w:lastRenderedPageBreak/>
               <w:t>Someone who is right with God.</w:t>
             </w:r>
           </w:p>
@@ -9735,7 +9721,6 @@
               </w:numPr>
             </w:pPr>
             <w:r>
-              <w:lastRenderedPageBreak/>
               <w:t>Someone or something that is set apart and dedicated to serve God.</w:t>
             </w:r>
           </w:p>
@@ -9806,6 +9791,7 @@
               <w:pStyle w:val="Compact"/>
             </w:pPr>
             <w:r>
+              <w:lastRenderedPageBreak/>
               <w:t xml:space="preserve">1 Corinthians </w:t>
             </w:r>
             <w:r>
@@ -9826,7 +9812,6 @@
               <w:pStyle w:val="Compact"/>
             </w:pPr>
             <w:r>
-              <w:lastRenderedPageBreak/>
               <w:t>Ephesians 1:4</w:t>
             </w:r>
             <w:r>
@@ -10230,15 +10215,15 @@
               <w:pStyle w:val="Compact"/>
             </w:pPr>
             <w:r>
+              <w:t>Hebrews 2:9</w:t>
+            </w:r>
+          </w:p>
+          <w:p>
+            <w:pPr>
+              <w:pStyle w:val="Compact"/>
+            </w:pPr>
+            <w:r>
               <w:lastRenderedPageBreak/>
-              <w:t>Hebrews 2:9</w:t>
-            </w:r>
-          </w:p>
-          <w:p>
-            <w:pPr>
-              <w:pStyle w:val="Compact"/>
-            </w:pPr>
-            <w:r>
               <w:t>1 Peter 2:17</w:t>
             </w:r>
             <w:r>
@@ -11127,15 +11112,15 @@
               <w:pStyle w:val="Compact"/>
             </w:pPr>
             <w:r>
+              <w:t xml:space="preserve">Acts 17:31 </w:t>
+            </w:r>
+          </w:p>
+          <w:p>
+            <w:pPr>
+              <w:pStyle w:val="Compact"/>
+            </w:pPr>
+            <w:r>
               <w:lastRenderedPageBreak/>
-              <w:t xml:space="preserve">Acts 17:31 </w:t>
-            </w:r>
-          </w:p>
-          <w:p>
-            <w:pPr>
-              <w:pStyle w:val="Compact"/>
-            </w:pPr>
-            <w:r>
               <w:t xml:space="preserve">Romans 2:1 </w:t>
             </w:r>
           </w:p>
@@ -11487,84 +11472,83 @@
           </w:tcPr>
           <w:p>
             <w:r>
+              <w:t>Matthew 4:</w:t>
+            </w:r>
+            <w:r>
+              <w:t>8</w:t>
+            </w:r>
+          </w:p>
+          <w:p>
+            <w:r>
+              <w:t>Mark 10:14</w:t>
+            </w:r>
+          </w:p>
+          <w:p>
+            <w:r>
+              <w:t>Luke 9:11</w:t>
+            </w:r>
+          </w:p>
+          <w:p>
+            <w:r>
+              <w:t>John 3:3</w:t>
+            </w:r>
+          </w:p>
+          <w:p>
+            <w:r>
+              <w:t>Acts 8:12</w:t>
+            </w:r>
+          </w:p>
+          <w:p>
+            <w:r>
+              <w:t>Romans 14:17</w:t>
+            </w:r>
+          </w:p>
+          <w:p>
+            <w:r>
+              <w:t>1 Corinthians 15:50</w:t>
+            </w:r>
+          </w:p>
+          <w:p>
+            <w:r>
+              <w:t>Ephesians 5:5</w:t>
+            </w:r>
+          </w:p>
+          <w:p>
+            <w:r>
+              <w:t>Colossians 1:13</w:t>
+            </w:r>
+          </w:p>
+          <w:p>
+            <w:r>
+              <w:t>2 Thessalonians 1:5</w:t>
+            </w:r>
+          </w:p>
+          <w:p>
+            <w:r>
+              <w:t>2 Timothy 4:18</w:t>
+            </w:r>
+          </w:p>
+          <w:p>
+            <w:r>
+              <w:t>Hebrews 12:28</w:t>
+            </w:r>
+          </w:p>
+          <w:p>
+            <w:r>
+              <w:t>James 2:5</w:t>
+            </w:r>
+          </w:p>
+          <w:p>
+            <w:r>
+              <w:t>2 Peter 1:11</w:t>
+            </w:r>
+          </w:p>
+          <w:p>
+            <w:pPr>
+              <w:pStyle w:val="Compact"/>
+            </w:pPr>
+            <w:r>
               <w:lastRenderedPageBreak/>
-              <w:t>Matthew 4:</w:t>
-            </w:r>
-            <w:r>
-              <w:t>8</w:t>
-            </w:r>
-          </w:p>
-          <w:p>
-            <w:r>
-              <w:t>Mark 10:14</w:t>
-            </w:r>
-          </w:p>
-          <w:p>
-            <w:r>
-              <w:t>Luke 9:11</w:t>
-            </w:r>
-          </w:p>
-          <w:p>
-            <w:r>
-              <w:t>John 3:3</w:t>
-            </w:r>
-          </w:p>
-          <w:p>
-            <w:r>
-              <w:t>Acts 8:12</w:t>
-            </w:r>
-          </w:p>
-          <w:p>
-            <w:r>
-              <w:t>Romans 14:17</w:t>
-            </w:r>
-          </w:p>
-          <w:p>
-            <w:r>
-              <w:t>1 Corinthians 15:50</w:t>
-            </w:r>
-          </w:p>
-          <w:p>
-            <w:r>
-              <w:t>Ephesians 5:5</w:t>
-            </w:r>
-          </w:p>
-          <w:p>
-            <w:r>
-              <w:t>Colossians 1:13</w:t>
-            </w:r>
-          </w:p>
-          <w:p>
-            <w:r>
-              <w:t>2 Thessalonians 1:5</w:t>
-            </w:r>
-          </w:p>
-          <w:p>
-            <w:r>
-              <w:t>2 Timothy 4:18</w:t>
-            </w:r>
-          </w:p>
-          <w:p>
-            <w:r>
-              <w:lastRenderedPageBreak/>
-              <w:t>Hebrews 12:28</w:t>
-            </w:r>
-          </w:p>
-          <w:p>
-            <w:r>
-              <w:t>James 2:5</w:t>
-            </w:r>
-          </w:p>
-          <w:p>
-            <w:r>
-              <w:t>2 Peter 1:11</w:t>
-            </w:r>
-          </w:p>
-          <w:p>
-            <w:pPr>
-              <w:pStyle w:val="Compact"/>
-            </w:pPr>
-            <w:r>
               <w:t xml:space="preserve">Revelation 11:15 </w:t>
             </w:r>
           </w:p>
@@ -12009,17 +11993,17 @@
           </w:p>
           <w:p>
             <w:r>
+              <w:t>Ephesians 4:18</w:t>
+            </w:r>
+          </w:p>
+          <w:p>
+            <w:r>
+              <w:t>Colossians 3:4</w:t>
+            </w:r>
+          </w:p>
+          <w:p>
+            <w:r>
               <w:lastRenderedPageBreak/>
-              <w:t>Ephesians 4:18</w:t>
-            </w:r>
-          </w:p>
-          <w:p>
-            <w:r>
-              <w:t>Colossians 3:4</w:t>
-            </w:r>
-          </w:p>
-          <w:p>
-            <w:r>
               <w:t>1 Timothy 4:8</w:t>
             </w:r>
           </w:p>
@@ -12343,7 +12327,6 @@
               </w:numPr>
             </w:pPr>
             <w:r>
-              <w:lastRenderedPageBreak/>
               <w:t>To love like God does, caring for people regardless of what they do. This includes forgiving them and sacrificing for them.</w:t>
             </w:r>
           </w:p>
@@ -12355,48 +12338,47 @@
           </w:tcPr>
           <w:p>
             <w:r>
+              <w:t xml:space="preserve">Matthew 5:46 </w:t>
+            </w:r>
+          </w:p>
+          <w:p>
+            <w:r>
+              <w:t>Mark 10:21</w:t>
+            </w:r>
+          </w:p>
+          <w:p>
+            <w:r>
+              <w:t>Luke 10:27</w:t>
+            </w:r>
+          </w:p>
+          <w:p>
+            <w:r>
+              <w:t xml:space="preserve">John 14:21 </w:t>
+            </w:r>
+          </w:p>
+          <w:p>
+            <w:r>
+              <w:t>Romans 8:28</w:t>
+            </w:r>
+          </w:p>
+          <w:p>
+            <w:r>
+              <w:t xml:space="preserve">1 Corinthians 13:4 </w:t>
+            </w:r>
+          </w:p>
+          <w:p>
+            <w:r>
+              <w:t>Galatians 2:20</w:t>
+            </w:r>
+          </w:p>
+          <w:p>
+            <w:r>
+              <w:t xml:space="preserve">Ephesians 5:25 </w:t>
+            </w:r>
+          </w:p>
+          <w:p>
+            <w:r>
               <w:lastRenderedPageBreak/>
-              <w:t xml:space="preserve">Matthew 5:46 </w:t>
-            </w:r>
-          </w:p>
-          <w:p>
-            <w:r>
-              <w:t>Mark 10:21</w:t>
-            </w:r>
-          </w:p>
-          <w:p>
-            <w:r>
-              <w:t>Luke 10:27</w:t>
-            </w:r>
-          </w:p>
-          <w:p>
-            <w:r>
-              <w:t xml:space="preserve">John 14:21 </w:t>
-            </w:r>
-          </w:p>
-          <w:p>
-            <w:r>
-              <w:lastRenderedPageBreak/>
-              <w:t>Romans 8:28</w:t>
-            </w:r>
-          </w:p>
-          <w:p>
-            <w:r>
-              <w:t xml:space="preserve">1 Corinthians 13:4 </w:t>
-            </w:r>
-          </w:p>
-          <w:p>
-            <w:r>
-              <w:t>Galatians 2:20</w:t>
-            </w:r>
-          </w:p>
-          <w:p>
-            <w:r>
-              <w:t xml:space="preserve">Ephesians 5:25 </w:t>
-            </w:r>
-          </w:p>
-          <w:p>
-            <w:r>
               <w:t>Philippians 1:9</w:t>
             </w:r>
           </w:p>
@@ -12758,7 +12740,6 @@
                 <w:b/>
                 <w:bCs/>
               </w:rPr>
-              <w:lastRenderedPageBreak/>
               <w:t xml:space="preserve">miracle </w:t>
             </w:r>
           </w:p>
@@ -12874,6 +12855,7 @@
               <w:pStyle w:val="Compact"/>
             </w:pPr>
             <w:r>
+              <w:lastRenderedPageBreak/>
               <w:t xml:space="preserve">Acts 2:22 </w:t>
             </w:r>
           </w:p>
@@ -12947,6 +12929,7 @@
                 <w:b/>
                 <w:bCs/>
               </w:rPr>
+              <w:lastRenderedPageBreak/>
               <w:t xml:space="preserve">nation </w:t>
             </w:r>
           </w:p>
@@ -13262,79 +13245,79 @@
               <w:pStyle w:val="Compact"/>
             </w:pPr>
             <w:r>
+              <w:t xml:space="preserve">Romans 10:16 </w:t>
+            </w:r>
+          </w:p>
+          <w:p>
+            <w:pPr>
+              <w:pStyle w:val="Compact"/>
+            </w:pPr>
+            <w:r>
+              <w:t xml:space="preserve">2 Corinthians 10:5 </w:t>
+            </w:r>
+          </w:p>
+          <w:p>
+            <w:pPr>
+              <w:pStyle w:val="Compact"/>
+            </w:pPr>
+            <w:r>
+              <w:t xml:space="preserve">Ephesians 6:1 </w:t>
+            </w:r>
+          </w:p>
+          <w:p>
+            <w:pPr>
+              <w:pStyle w:val="Compact"/>
+            </w:pPr>
+            <w:r>
+              <w:t xml:space="preserve">Philippians 2:12 </w:t>
+            </w:r>
+          </w:p>
+          <w:p>
+            <w:pPr>
+              <w:pStyle w:val="Compact"/>
+            </w:pPr>
+            <w:r>
+              <w:t xml:space="preserve">Colossians 3:20 </w:t>
+            </w:r>
+          </w:p>
+          <w:p>
+            <w:pPr>
+              <w:pStyle w:val="Compact"/>
+            </w:pPr>
+            <w:r>
+              <w:t xml:space="preserve">2 Thessalonians 3:14 </w:t>
+            </w:r>
+          </w:p>
+          <w:p>
+            <w:pPr>
+              <w:pStyle w:val="Compact"/>
+            </w:pPr>
+            <w:r>
+              <w:t xml:space="preserve">Philemon 1:21 </w:t>
+            </w:r>
+          </w:p>
+          <w:p>
+            <w:pPr>
+              <w:pStyle w:val="Compact"/>
+            </w:pPr>
+            <w:r>
+              <w:t xml:space="preserve">Hebrews 5:9 </w:t>
+            </w:r>
+          </w:p>
+          <w:p>
+            <w:pPr>
+              <w:pStyle w:val="Compact"/>
+            </w:pPr>
+            <w:r>
+              <w:t xml:space="preserve">Hebrews 11:8 </w:t>
+            </w:r>
+          </w:p>
+          <w:p>
+            <w:pPr>
+              <w:pStyle w:val="Compact"/>
+            </w:pPr>
+            <w:r>
               <w:lastRenderedPageBreak/>
-              <w:t xml:space="preserve">Romans 10:16 </w:t>
-            </w:r>
-          </w:p>
-          <w:p>
-            <w:pPr>
-              <w:pStyle w:val="Compact"/>
-            </w:pPr>
-            <w:r>
-              <w:t xml:space="preserve">2 Corinthians 10:5 </w:t>
-            </w:r>
-          </w:p>
-          <w:p>
-            <w:pPr>
-              <w:pStyle w:val="Compact"/>
-            </w:pPr>
-            <w:r>
-              <w:t xml:space="preserve">Ephesians 6:1 </w:t>
-            </w:r>
-          </w:p>
-          <w:p>
-            <w:pPr>
-              <w:pStyle w:val="Compact"/>
-            </w:pPr>
-            <w:r>
-              <w:t xml:space="preserve">Philippians 2:12 </w:t>
-            </w:r>
-          </w:p>
-          <w:p>
-            <w:pPr>
-              <w:pStyle w:val="Compact"/>
-            </w:pPr>
-            <w:r>
-              <w:t xml:space="preserve">Colossians 3:20 </w:t>
-            </w:r>
-          </w:p>
-          <w:p>
-            <w:pPr>
-              <w:pStyle w:val="Compact"/>
-            </w:pPr>
-            <w:r>
-              <w:t xml:space="preserve">2 Thessalonians 3:14 </w:t>
-            </w:r>
-          </w:p>
-          <w:p>
-            <w:pPr>
-              <w:pStyle w:val="Compact"/>
-            </w:pPr>
-            <w:r>
-              <w:t xml:space="preserve">Philemon 1:21 </w:t>
-            </w:r>
-          </w:p>
-          <w:p>
-            <w:pPr>
-              <w:pStyle w:val="Compact"/>
-            </w:pPr>
-            <w:r>
-              <w:t xml:space="preserve">Hebrews 5:9 </w:t>
-            </w:r>
-          </w:p>
-          <w:p>
-            <w:pPr>
-              <w:pStyle w:val="Compact"/>
-            </w:pPr>
-            <w:r>
-              <w:t xml:space="preserve">Hebrews 11:8 </w:t>
-            </w:r>
-          </w:p>
-          <w:p>
-            <w:pPr>
-              <w:pStyle w:val="Compact"/>
-            </w:pPr>
-            <w:r>
               <w:t xml:space="preserve">1 Peter 3:6 </w:t>
             </w:r>
           </w:p>
@@ -13687,7 +13670,6 @@
               <w:pStyle w:val="Compact"/>
             </w:pPr>
             <w:r>
-              <w:lastRenderedPageBreak/>
               <w:t xml:space="preserve">2 Corinthians 8:18 </w:t>
             </w:r>
           </w:p>
@@ -13761,7 +13743,6 @@
                 <w:b/>
                 <w:bCs/>
               </w:rPr>
-              <w:lastRenderedPageBreak/>
               <w:t>pray</w:t>
             </w:r>
           </w:p>
@@ -13807,6 +13788,7 @@
               </w:numPr>
             </w:pPr>
             <w:r>
+              <w:lastRenderedPageBreak/>
               <w:t>To ask God to do something.</w:t>
             </w:r>
           </w:p>
@@ -13837,6 +13819,7 @@
               <w:pStyle w:val="Compact"/>
             </w:pPr>
             <w:r>
+              <w:lastRenderedPageBreak/>
               <w:t xml:space="preserve">Matthew 6:6 </w:t>
             </w:r>
           </w:p>
@@ -13861,6 +13844,7 @@
               <w:pStyle w:val="Compact"/>
             </w:pPr>
             <w:r>
+              <w:lastRenderedPageBreak/>
               <w:t xml:space="preserve">Acts 16:25 </w:t>
             </w:r>
           </w:p>
@@ -13974,6 +13958,7 @@
                 <w:b/>
                 <w:bCs/>
               </w:rPr>
+              <w:lastRenderedPageBreak/>
               <w:t xml:space="preserve">promise </w:t>
             </w:r>
           </w:p>
@@ -14151,7 +14136,6 @@
               <w:pStyle w:val="Compact"/>
             </w:pPr>
             <w:r>
-              <w:lastRenderedPageBreak/>
               <w:t xml:space="preserve">Hebrews 6:12 </w:t>
             </w:r>
           </w:p>
@@ -14201,7 +14185,6 @@
                 <w:b/>
                 <w:bCs/>
               </w:rPr>
-              <w:lastRenderedPageBreak/>
               <w:t>p</w:t>
             </w:r>
             <w:r>
@@ -14322,6 +14305,7 @@
               <w:pStyle w:val="Compact"/>
             </w:pPr>
             <w:r>
+              <w:lastRenderedPageBreak/>
               <w:t xml:space="preserve">1 Thessalonians 5:20 </w:t>
             </w:r>
           </w:p>
@@ -14412,6 +14396,7 @@
                 <w:b/>
                 <w:bCs/>
               </w:rPr>
+              <w:lastRenderedPageBreak/>
               <w:t>redeem</w:t>
             </w:r>
           </w:p>
@@ -14644,7 +14629,6 @@
               <w:pStyle w:val="Compact"/>
             </w:pPr>
             <w:r>
-              <w:lastRenderedPageBreak/>
               <w:t xml:space="preserve">1 Corinthians 1:30 </w:t>
             </w:r>
           </w:p>
@@ -14710,7 +14694,6 @@
                 <w:b/>
                 <w:bCs/>
               </w:rPr>
-              <w:lastRenderedPageBreak/>
               <w:t>repent</w:t>
             </w:r>
           </w:p>
@@ -14828,6 +14811,7 @@
               <w:pStyle w:val="Compact"/>
             </w:pPr>
             <w:r>
+              <w:lastRenderedPageBreak/>
               <w:t xml:space="preserve">Acts 2:38 </w:t>
             </w:r>
           </w:p>
@@ -14901,6 +14885,7 @@
                 <w:b/>
                 <w:bCs/>
               </w:rPr>
+              <w:lastRenderedPageBreak/>
               <w:t xml:space="preserve">resurrection </w:t>
             </w:r>
           </w:p>
@@ -15070,7 +15055,6 @@
               <w:pStyle w:val="Compact"/>
             </w:pPr>
             <w:r>
-              <w:lastRenderedPageBreak/>
               <w:t xml:space="preserve">Hebrews 11:35 </w:t>
             </w:r>
           </w:p>
@@ -15112,7 +15096,6 @@
                 <w:b/>
                 <w:bCs/>
               </w:rPr>
-              <w:lastRenderedPageBreak/>
               <w:t xml:space="preserve">righteous </w:t>
             </w:r>
           </w:p>
@@ -15299,6 +15282,7 @@
                 <w:b/>
                 <w:bCs/>
               </w:rPr>
+              <w:lastRenderedPageBreak/>
               <w:t xml:space="preserve">sacrifice </w:t>
             </w:r>
           </w:p>
@@ -15508,7 +15492,6 @@
                 <w:b/>
                 <w:bCs/>
               </w:rPr>
-              <w:lastRenderedPageBreak/>
               <w:t xml:space="preserve">salvation </w:t>
             </w:r>
           </w:p>
@@ -15720,6 +15703,7 @@
                 <w:b/>
                 <w:bCs/>
               </w:rPr>
+              <w:lastRenderedPageBreak/>
               <w:t>s</w:t>
             </w:r>
             <w:r>
@@ -16025,7 +16009,6 @@
               <w:pStyle w:val="Compact"/>
             </w:pPr>
             <w:r>
-              <w:lastRenderedPageBreak/>
               <w:t xml:space="preserve">1 Corinthians 1:18 </w:t>
             </w:r>
           </w:p>
@@ -16115,7 +16098,6 @@
                 <w:b/>
                 <w:bCs/>
               </w:rPr>
-              <w:lastRenderedPageBreak/>
               <w:t xml:space="preserve">scriptures </w:t>
             </w:r>
           </w:p>
@@ -16173,7 +16155,11 @@
           <w:p/>
           <w:p>
             <w:r>
-              <w:t>Sometimes this word is used to introduce something written in the Old Testament. When used this way, it means that what was written should be trusted and obeyed.</w:t>
+              <w:t xml:space="preserve">Sometimes this word is used to introduce something written in the Old Testament. When used this way, it </w:t>
+            </w:r>
+            <w:r>
+              <w:lastRenderedPageBreak/>
+              <w:t>means that what was written should be trusted and obeyed.</w:t>
             </w:r>
           </w:p>
         </w:tc>
@@ -16186,6 +16172,7 @@
               <w:pStyle w:val="Compact"/>
             </w:pPr>
             <w:r>
+              <w:lastRenderedPageBreak/>
               <w:t>Matthew 21:42</w:t>
             </w:r>
           </w:p>
@@ -16250,6 +16237,7 @@
               <w:pStyle w:val="Compact"/>
             </w:pPr>
             <w:r>
+              <w:lastRenderedPageBreak/>
               <w:t xml:space="preserve">Galatians 3:8 </w:t>
             </w:r>
           </w:p>
@@ -16315,6 +16303,7 @@
                 <w:b/>
                 <w:bCs/>
               </w:rPr>
+              <w:lastRenderedPageBreak/>
               <w:t>shame</w:t>
             </w:r>
           </w:p>
@@ -16455,7 +16444,6 @@
                 <w:b/>
                 <w:bCs/>
               </w:rPr>
-              <w:lastRenderedPageBreak/>
               <w:t xml:space="preserve">sheep </w:t>
             </w:r>
           </w:p>
@@ -16752,6 +16740,7 @@
               <w:pStyle w:val="Compact"/>
             </w:pPr>
             <w:r>
+              <w:lastRenderedPageBreak/>
               <w:t xml:space="preserve">1 Corinthians 9:7  </w:t>
             </w:r>
           </w:p>
@@ -16812,6 +16801,7 @@
                 <w:b/>
                 <w:bCs/>
               </w:rPr>
+              <w:lastRenderedPageBreak/>
               <w:t>sin</w:t>
             </w:r>
           </w:p>
@@ -16914,7 +16904,6 @@
           </w:p>
           <w:p>
             <w:r>
-              <w:lastRenderedPageBreak/>
               <w:t>Colossians 1:14</w:t>
             </w:r>
           </w:p>
@@ -16967,7 +16956,6 @@
                 <w:b/>
                 <w:bCs/>
               </w:rPr>
-              <w:lastRenderedPageBreak/>
               <w:t xml:space="preserve">Son of God </w:t>
             </w:r>
           </w:p>
@@ -17101,6 +17089,7 @@
                 <w:b/>
                 <w:bCs/>
               </w:rPr>
+              <w:lastRenderedPageBreak/>
               <w:t xml:space="preserve">Son of Man </w:t>
             </w:r>
           </w:p>
@@ -17191,7 +17180,6 @@
           </w:p>
           <w:p>
             <w:r>
-              <w:lastRenderedPageBreak/>
               <w:t>Revelation 14:14</w:t>
             </w:r>
           </w:p>
@@ -17217,7 +17205,6 @@
                 <w:b/>
                 <w:bCs/>
               </w:rPr>
-              <w:lastRenderedPageBreak/>
               <w:t xml:space="preserve">soul </w:t>
             </w:r>
           </w:p>
@@ -17523,6 +17510,7 @@
           </w:p>
           <w:p>
             <w:r>
+              <w:lastRenderedPageBreak/>
               <w:t xml:space="preserve">Galatians 5:25 </w:t>
             </w:r>
           </w:p>
@@ -17971,6 +17959,7 @@
                 <w:b/>
                 <w:bCs/>
               </w:rPr>
+              <w:lastRenderedPageBreak/>
               <w:t>tree</w:t>
             </w:r>
             <w:r>
@@ -17993,11 +17982,7 @@
               <w:t xml:space="preserve">      </w:t>
             </w:r>
             <w:r>
-              <w:t xml:space="preserve">A cross was an upright wooden post stuck into the ground with a wooden beam going across it near the top. During the time of the Roman Empire, the Roman </w:t>
-            </w:r>
-            <w:r>
-              <w:lastRenderedPageBreak/>
-              <w:t>government killed criminals by tying or nailing them to a cross and leaving them there to die.</w:t>
+              <w:t>A cross was an upright wooden post stuck into the ground with a wooden beam going across it near the top. During the time of the Roman Empire, the Roman government killed criminals by tying or nailing them to a cross and leaving them there to die.</w:t>
             </w:r>
           </w:p>
         </w:tc>
@@ -18007,7 +17992,6 @@
           </w:tcPr>
           <w:p>
             <w:r>
-              <w:lastRenderedPageBreak/>
               <w:t>Acts 5:30</w:t>
             </w:r>
           </w:p>
@@ -18453,6 +18437,7 @@
                 <w:b/>
                 <w:bCs/>
               </w:rPr>
+              <w:lastRenderedPageBreak/>
               <w:t>will (of God)</w:t>
             </w:r>
           </w:p>
@@ -18511,7 +18496,6 @@
               </w:numPr>
             </w:pPr>
             <w:r>
-              <w:lastRenderedPageBreak/>
               <w:t>What is pleasing to God.</w:t>
             </w:r>
           </w:p>
@@ -18534,7 +18518,6 @@
           </w:tcPr>
           <w:p>
             <w:r>
-              <w:lastRenderedPageBreak/>
               <w:t xml:space="preserve">Matthew 6:10 </w:t>
             </w:r>
           </w:p>
@@ -18555,7 +18538,6 @@
           </w:p>
           <w:p>
             <w:r>
-              <w:lastRenderedPageBreak/>
               <w:t>Romans 12:2</w:t>
             </w:r>
           </w:p>
@@ -18634,7 +18616,6 @@
                 <w:b/>
                 <w:bCs/>
               </w:rPr>
-              <w:lastRenderedPageBreak/>
               <w:t>wisdom</w:t>
             </w:r>
           </w:p>
@@ -18986,6 +18967,7 @@
               <w:pStyle w:val="Compact"/>
             </w:pPr>
             <w:r>
+              <w:lastRenderedPageBreak/>
               <w:t xml:space="preserve">Ephesians 5:15 </w:t>
             </w:r>
           </w:p>
@@ -19630,7 +19612,7 @@
 </file>
 
 <file path=word/numbering.xml><?xml version="1.0" encoding="utf-8"?>
-<w:numbering xmlns:wpc="http://schemas.microsoft.com/office/word/2010/wordprocessingCanvas" xmlns:cx="http://schemas.microsoft.com/office/drawing/2014/chartex" xmlns:cx1="http://schemas.microsoft.com/office/drawing/2015/9/8/chartex" xmlns:cx2="http://schemas.microsoft.com/office/drawing/2015/10/21/chartex" xmlns:cx3="http://schemas.microsoft.com/office/drawing/2016/5/9/chartex" xmlns:cx4="http://schemas.microsoft.com/office/drawing/2016/5/10/chartex" xmlns:cx5="http://schemas.microsoft.com/office/drawing/2016/5/11/chartex" xmlns:cx6="http://schemas.microsoft.com/office/drawing/2016/5/12/chartex" xmlns:cx7="http://schemas.microsoft.com/office/drawing/2016/5/13/chartex" xmlns:cx8="http://schemas.microsoft.com/office/drawing/2016/5/14/chartex" xmlns:mc="http://schemas.openxmlformats.org/markup-compatibility/2006" xmlns:aink="http://schemas.microsoft.com/office/drawing/2016/ink" xmlns:am3d="http://schemas.microsoft.com/office/drawing/2017/model3d" xmlns:o="urn:schemas-microsoft-com:office:office" xmlns:oel="http://schemas.microsoft.com/office/2019/extlst" xmlns:r="http://schemas.openxmlformats.org/officeDocument/2006/relationships" xmlns:m="http://schemas.openxmlformats.org/officeDocument/2006/math" xmlns:v="urn:schemas-microsoft-com:vml" xmlns:wp14="http://schemas.microsoft.com/office/word/2010/wordprocessingDrawing" xmlns:wp="http://schemas.openxmlformats.org/drawingml/2006/wordprocessingDrawing" xmlns:w10="urn:schemas-microsoft-com:office:word" xmlns:w="http://schemas.openxmlformats.org/wordprocessingml/2006/main" xmlns:w14="http://schemas.microsoft.com/office/word/2010/wordml" xmlns:w15="http://schemas.microsoft.com/office/word/2012/wordml" xmlns:w16cex="http://schemas.microsoft.com/office/word/2018/wordml/cex" xmlns:w16cid="http://schemas.microsoft.com/office/word/2016/wordml/cid" xmlns:w16="http://schemas.microsoft.com/office/word/2018/wordml" xmlns:w16du="http://schemas.microsoft.com/office/word/2023/wordml/word16du" xmlns:w16sdtdh="http://schemas.microsoft.com/office/word/2020/wordml/sdtdatahash" xmlns:w16se="http://schemas.microsoft.com/office/word/2015/wordml/symex" xmlns:wpg="http://schemas.microsoft.com/office/word/2010/wordprocessingGroup" xmlns:wpi="http://schemas.microsoft.com/office/word/2010/wordprocessingInk" xmlns:wne="http://schemas.microsoft.com/office/word/2006/wordml" xmlns:wps="http://schemas.microsoft.com/office/word/2010/wordprocessingShape" mc:Ignorable="w14 w15 w16se w16cid w16 w16cex w16sdtdh w16du wp14">
+<w:numbering xmlns:wpc="http://schemas.microsoft.com/office/word/2010/wordprocessingCanvas" xmlns:mc="http://schemas.openxmlformats.org/markup-compatibility/2006" xmlns:o="urn:schemas-microsoft-com:office:office" xmlns:r="http://schemas.openxmlformats.org/officeDocument/2006/relationships" xmlns:m="http://schemas.openxmlformats.org/officeDocument/2006/math" xmlns:v="urn:schemas-microsoft-com:vml" xmlns:wp14="http://schemas.microsoft.com/office/word/2010/wordprocessingDrawing" xmlns:wp="http://schemas.openxmlformats.org/drawingml/2006/wordprocessingDrawing" xmlns:w10="urn:schemas-microsoft-com:office:word" xmlns:w="http://schemas.openxmlformats.org/wordprocessingml/2006/main" xmlns:w14="http://schemas.microsoft.com/office/word/2010/wordml" xmlns:w15="http://schemas.microsoft.com/office/word/2012/wordml" xmlns:wpg="http://schemas.microsoft.com/office/word/2010/wordprocessingGroup" xmlns:wpi="http://schemas.microsoft.com/office/word/2010/wordprocessingInk" xmlns:wne="http://schemas.microsoft.com/office/word/2006/wordml" xmlns:wps="http://schemas.microsoft.com/office/word/2010/wordprocessingShape" mc:Ignorable="w14 w15 wp14">
   <w:abstractNum w:abstractNumId="0" w15:restartNumberingAfterBreak="0">
     <w:nsid w:val="0000A991"/>
     <w:multiLevelType w:val="multilevel"/>
@@ -29156,256 +29138,256 @@
       </w:rPr>
     </w:lvl>
   </w:abstractNum>
-  <w:num w:numId="1" w16cid:durableId="193733981">
+  <w:num w:numId="1">
     <w:abstractNumId w:val="8"/>
   </w:num>
-  <w:num w:numId="2" w16cid:durableId="760030379">
+  <w:num w:numId="2">
     <w:abstractNumId w:val="83"/>
   </w:num>
-  <w:num w:numId="3" w16cid:durableId="527137262">
+  <w:num w:numId="3">
     <w:abstractNumId w:val="82"/>
   </w:num>
-  <w:num w:numId="4" w16cid:durableId="425269955">
+  <w:num w:numId="4">
     <w:abstractNumId w:val="55"/>
   </w:num>
-  <w:num w:numId="5" w16cid:durableId="1056247886">
+  <w:num w:numId="5">
     <w:abstractNumId w:val="26"/>
   </w:num>
-  <w:num w:numId="6" w16cid:durableId="1470243334">
+  <w:num w:numId="6">
     <w:abstractNumId w:val="66"/>
   </w:num>
-  <w:num w:numId="7" w16cid:durableId="1869676824">
+  <w:num w:numId="7">
     <w:abstractNumId w:val="30"/>
   </w:num>
-  <w:num w:numId="8" w16cid:durableId="1679767248">
+  <w:num w:numId="8">
     <w:abstractNumId w:val="4"/>
   </w:num>
-  <w:num w:numId="9" w16cid:durableId="1274627801">
+  <w:num w:numId="9">
     <w:abstractNumId w:val="20"/>
   </w:num>
-  <w:num w:numId="10" w16cid:durableId="717171090">
+  <w:num w:numId="10">
     <w:abstractNumId w:val="80"/>
   </w:num>
-  <w:num w:numId="11" w16cid:durableId="1394428091">
+  <w:num w:numId="11">
     <w:abstractNumId w:val="71"/>
   </w:num>
-  <w:num w:numId="12" w16cid:durableId="1028337723">
+  <w:num w:numId="12">
     <w:abstractNumId w:val="69"/>
   </w:num>
-  <w:num w:numId="13" w16cid:durableId="1152411401">
+  <w:num w:numId="13">
     <w:abstractNumId w:val="27"/>
   </w:num>
-  <w:num w:numId="14" w16cid:durableId="662703860">
+  <w:num w:numId="14">
     <w:abstractNumId w:val="39"/>
   </w:num>
-  <w:num w:numId="15" w16cid:durableId="928805173">
+  <w:num w:numId="15">
     <w:abstractNumId w:val="37"/>
   </w:num>
-  <w:num w:numId="16" w16cid:durableId="1709529939">
+  <w:num w:numId="16">
     <w:abstractNumId w:val="41"/>
   </w:num>
-  <w:num w:numId="17" w16cid:durableId="1150367587">
+  <w:num w:numId="17">
     <w:abstractNumId w:val="1"/>
   </w:num>
-  <w:num w:numId="18" w16cid:durableId="543833968">
+  <w:num w:numId="18">
     <w:abstractNumId w:val="73"/>
   </w:num>
-  <w:num w:numId="19" w16cid:durableId="756486473">
+  <w:num w:numId="19">
     <w:abstractNumId w:val="49"/>
   </w:num>
-  <w:num w:numId="20" w16cid:durableId="1275362702">
+  <w:num w:numId="20">
     <w:abstractNumId w:val="3"/>
   </w:num>
-  <w:num w:numId="21" w16cid:durableId="545458975">
+  <w:num w:numId="21">
     <w:abstractNumId w:val="47"/>
   </w:num>
-  <w:num w:numId="22" w16cid:durableId="1589075198">
+  <w:num w:numId="22">
     <w:abstractNumId w:val="40"/>
   </w:num>
-  <w:num w:numId="23" w16cid:durableId="392431635">
+  <w:num w:numId="23">
     <w:abstractNumId w:val="53"/>
   </w:num>
-  <w:num w:numId="24" w16cid:durableId="428933504">
+  <w:num w:numId="24">
     <w:abstractNumId w:val="34"/>
   </w:num>
-  <w:num w:numId="25" w16cid:durableId="733357364">
+  <w:num w:numId="25">
     <w:abstractNumId w:val="2"/>
   </w:num>
-  <w:num w:numId="26" w16cid:durableId="266743309">
+  <w:num w:numId="26">
     <w:abstractNumId w:val="70"/>
   </w:num>
-  <w:num w:numId="27" w16cid:durableId="630402698">
+  <w:num w:numId="27">
     <w:abstractNumId w:val="15"/>
   </w:num>
-  <w:num w:numId="28" w16cid:durableId="384452694">
+  <w:num w:numId="28">
     <w:abstractNumId w:val="42"/>
   </w:num>
-  <w:num w:numId="29" w16cid:durableId="840973392">
+  <w:num w:numId="29">
     <w:abstractNumId w:val="13"/>
   </w:num>
-  <w:num w:numId="30" w16cid:durableId="1205867415">
+  <w:num w:numId="30">
     <w:abstractNumId w:val="31"/>
   </w:num>
-  <w:num w:numId="31" w16cid:durableId="381904598">
+  <w:num w:numId="31">
     <w:abstractNumId w:val="72"/>
   </w:num>
-  <w:num w:numId="32" w16cid:durableId="555438986">
+  <w:num w:numId="32">
     <w:abstractNumId w:val="25"/>
   </w:num>
-  <w:num w:numId="33" w16cid:durableId="652756369">
+  <w:num w:numId="33">
     <w:abstractNumId w:val="10"/>
   </w:num>
-  <w:num w:numId="34" w16cid:durableId="287206062">
+  <w:num w:numId="34">
     <w:abstractNumId w:val="48"/>
   </w:num>
-  <w:num w:numId="35" w16cid:durableId="876743842">
+  <w:num w:numId="35">
     <w:abstractNumId w:val="50"/>
   </w:num>
-  <w:num w:numId="36" w16cid:durableId="1617787493">
+  <w:num w:numId="36">
     <w:abstractNumId w:val="32"/>
   </w:num>
-  <w:num w:numId="37" w16cid:durableId="69692028">
+  <w:num w:numId="37">
     <w:abstractNumId w:val="63"/>
   </w:num>
-  <w:num w:numId="38" w16cid:durableId="1185827661">
+  <w:num w:numId="38">
     <w:abstractNumId w:val="14"/>
   </w:num>
-  <w:num w:numId="39" w16cid:durableId="635961693">
+  <w:num w:numId="39">
     <w:abstractNumId w:val="60"/>
   </w:num>
-  <w:num w:numId="40" w16cid:durableId="616986513">
+  <w:num w:numId="40">
     <w:abstractNumId w:val="35"/>
   </w:num>
-  <w:num w:numId="41" w16cid:durableId="2025356426">
+  <w:num w:numId="41">
     <w:abstractNumId w:val="11"/>
   </w:num>
-  <w:num w:numId="42" w16cid:durableId="321353503">
+  <w:num w:numId="42">
     <w:abstractNumId w:val="33"/>
   </w:num>
-  <w:num w:numId="43" w16cid:durableId="1483160115">
+  <w:num w:numId="43">
     <w:abstractNumId w:val="76"/>
   </w:num>
-  <w:num w:numId="44" w16cid:durableId="262609934">
+  <w:num w:numId="44">
     <w:abstractNumId w:val="56"/>
   </w:num>
-  <w:num w:numId="45" w16cid:durableId="506793433">
+  <w:num w:numId="45">
     <w:abstractNumId w:val="68"/>
   </w:num>
-  <w:num w:numId="46" w16cid:durableId="1657997144">
+  <w:num w:numId="46">
     <w:abstractNumId w:val="81"/>
   </w:num>
-  <w:num w:numId="47" w16cid:durableId="896474799">
+  <w:num w:numId="47">
     <w:abstractNumId w:val="52"/>
   </w:num>
-  <w:num w:numId="48" w16cid:durableId="1942183771">
+  <w:num w:numId="48">
     <w:abstractNumId w:val="65"/>
   </w:num>
-  <w:num w:numId="49" w16cid:durableId="467937617">
+  <w:num w:numId="49">
     <w:abstractNumId w:val="44"/>
   </w:num>
-  <w:num w:numId="50" w16cid:durableId="2027781289">
+  <w:num w:numId="50">
     <w:abstractNumId w:val="22"/>
   </w:num>
-  <w:num w:numId="51" w16cid:durableId="1400859783">
+  <w:num w:numId="51">
     <w:abstractNumId w:val="29"/>
   </w:num>
-  <w:num w:numId="52" w16cid:durableId="2136675572">
+  <w:num w:numId="52">
     <w:abstractNumId w:val="74"/>
   </w:num>
-  <w:num w:numId="53" w16cid:durableId="1894732053">
+  <w:num w:numId="53">
     <w:abstractNumId w:val="45"/>
   </w:num>
-  <w:num w:numId="54" w16cid:durableId="520751718">
+  <w:num w:numId="54">
     <w:abstractNumId w:val="9"/>
   </w:num>
-  <w:num w:numId="55" w16cid:durableId="129371697">
+  <w:num w:numId="55">
     <w:abstractNumId w:val="23"/>
   </w:num>
-  <w:num w:numId="56" w16cid:durableId="1364014439">
+  <w:num w:numId="56">
     <w:abstractNumId w:val="59"/>
   </w:num>
-  <w:num w:numId="57" w16cid:durableId="771709124">
+  <w:num w:numId="57">
     <w:abstractNumId w:val="17"/>
   </w:num>
-  <w:num w:numId="58" w16cid:durableId="2144036288">
+  <w:num w:numId="58">
     <w:abstractNumId w:val="43"/>
   </w:num>
-  <w:num w:numId="59" w16cid:durableId="1148939237">
+  <w:num w:numId="59">
     <w:abstractNumId w:val="64"/>
   </w:num>
-  <w:num w:numId="60" w16cid:durableId="1560821708">
+  <w:num w:numId="60">
     <w:abstractNumId w:val="19"/>
   </w:num>
-  <w:num w:numId="61" w16cid:durableId="1579944128">
+  <w:num w:numId="61">
     <w:abstractNumId w:val="54"/>
   </w:num>
-  <w:num w:numId="62" w16cid:durableId="1788967850">
+  <w:num w:numId="62">
     <w:abstractNumId w:val="79"/>
   </w:num>
-  <w:num w:numId="63" w16cid:durableId="1751467098">
+  <w:num w:numId="63">
     <w:abstractNumId w:val="78"/>
   </w:num>
-  <w:num w:numId="64" w16cid:durableId="1762290188">
+  <w:num w:numId="64">
     <w:abstractNumId w:val="24"/>
   </w:num>
-  <w:num w:numId="65" w16cid:durableId="1675720596">
+  <w:num w:numId="65">
     <w:abstractNumId w:val="28"/>
   </w:num>
-  <w:num w:numId="66" w16cid:durableId="494029160">
+  <w:num w:numId="66">
     <w:abstractNumId w:val="61"/>
   </w:num>
-  <w:num w:numId="67" w16cid:durableId="1613508675">
+  <w:num w:numId="67">
     <w:abstractNumId w:val="38"/>
   </w:num>
-  <w:num w:numId="68" w16cid:durableId="1701083051">
+  <w:num w:numId="68">
     <w:abstractNumId w:val="16"/>
   </w:num>
-  <w:num w:numId="69" w16cid:durableId="627979772">
+  <w:num w:numId="69">
     <w:abstractNumId w:val="36"/>
   </w:num>
-  <w:num w:numId="70" w16cid:durableId="1471744833">
+  <w:num w:numId="70">
     <w:abstractNumId w:val="67"/>
   </w:num>
-  <w:num w:numId="71" w16cid:durableId="1815219610">
+  <w:num w:numId="71">
     <w:abstractNumId w:val="58"/>
   </w:num>
-  <w:num w:numId="72" w16cid:durableId="1022363581">
+  <w:num w:numId="72">
     <w:abstractNumId w:val="12"/>
   </w:num>
-  <w:num w:numId="73" w16cid:durableId="1395355708">
+  <w:num w:numId="73">
     <w:abstractNumId w:val="57"/>
   </w:num>
-  <w:num w:numId="74" w16cid:durableId="1727295882">
+  <w:num w:numId="74">
     <w:abstractNumId w:val="6"/>
   </w:num>
-  <w:num w:numId="75" w16cid:durableId="1544710060">
+  <w:num w:numId="75">
     <w:abstractNumId w:val="5"/>
   </w:num>
-  <w:num w:numId="76" w16cid:durableId="1517110351">
+  <w:num w:numId="76">
     <w:abstractNumId w:val="46"/>
   </w:num>
-  <w:num w:numId="77" w16cid:durableId="830024579">
+  <w:num w:numId="77">
     <w:abstractNumId w:val="62"/>
   </w:num>
-  <w:num w:numId="78" w16cid:durableId="1301959989">
+  <w:num w:numId="78">
     <w:abstractNumId w:val="18"/>
   </w:num>
-  <w:num w:numId="79" w16cid:durableId="527722823">
+  <w:num w:numId="79">
     <w:abstractNumId w:val="0"/>
   </w:num>
-  <w:num w:numId="80" w16cid:durableId="1649673462">
+  <w:num w:numId="80">
     <w:abstractNumId w:val="77"/>
   </w:num>
-  <w:num w:numId="81" w16cid:durableId="827869873">
+  <w:num w:numId="81">
     <w:abstractNumId w:val="21"/>
   </w:num>
-  <w:num w:numId="82" w16cid:durableId="2070227426">
+  <w:num w:numId="82">
     <w:abstractNumId w:val="75"/>
   </w:num>
-  <w:num w:numId="83" w16cid:durableId="630475349">
+  <w:num w:numId="83">
     <w:abstractNumId w:val="51"/>
   </w:num>
-  <w:num w:numId="84" w16cid:durableId="1209075268">
+  <w:num w:numId="84">
     <w:abstractNumId w:val="7"/>
   </w:num>
   <w:numIdMacAtCleanup w:val="78"/>
@@ -29413,7 +29395,7 @@
 </file>
 
 <file path=word/styles.xml><?xml version="1.0" encoding="utf-8"?>
-<w:styles xmlns:mc="http://schemas.openxmlformats.org/markup-compatibility/2006" xmlns:r="http://schemas.openxmlformats.org/officeDocument/2006/relationships" xmlns:w="http://schemas.openxmlformats.org/wordprocessingml/2006/main" xmlns:w14="http://schemas.microsoft.com/office/word/2010/wordml" xmlns:w15="http://schemas.microsoft.com/office/word/2012/wordml" xmlns:w16cex="http://schemas.microsoft.com/office/word/2018/wordml/cex" xmlns:w16cid="http://schemas.microsoft.com/office/word/2016/wordml/cid" xmlns:w16="http://schemas.microsoft.com/office/word/2018/wordml" xmlns:w16du="http://schemas.microsoft.com/office/word/2023/wordml/word16du" xmlns:w16sdtdh="http://schemas.microsoft.com/office/word/2020/wordml/sdtdatahash" xmlns:w16se="http://schemas.microsoft.com/office/word/2015/wordml/symex" mc:Ignorable="w14 w15 w16se w16cid w16 w16cex w16sdtdh w16du">
+<w:styles xmlns:mc="http://schemas.openxmlformats.org/markup-compatibility/2006" xmlns:r="http://schemas.openxmlformats.org/officeDocument/2006/relationships" xmlns:w="http://schemas.openxmlformats.org/wordprocessingml/2006/main" xmlns:w14="http://schemas.microsoft.com/office/word/2010/wordml" xmlns:w15="http://schemas.microsoft.com/office/word/2012/wordml" mc:Ignorable="w14 w15">
   <w:docDefaults>
     <w:rPrDefault>
       <w:rPr>
@@ -29427,7 +29409,7 @@
     </w:rPrDefault>
     <w:pPrDefault/>
   </w:docDefaults>
-  <w:latentStyles w:defLockedState="0" w:defUIPriority="99" w:defSemiHidden="0" w:defUnhideWhenUsed="0" w:defQFormat="0" w:count="376">
+  <w:latentStyles w:defLockedState="0" w:defUIPriority="99" w:defSemiHidden="0" w:defUnhideWhenUsed="0" w:defQFormat="0" w:count="371">
     <w:lsdException w:name="Normal" w:uiPriority="0" w:qFormat="1"/>
     <w:lsdException w:name="heading 1" w:uiPriority="9" w:qFormat="1"/>
     <w:lsdException w:name="heading 2" w:semiHidden="1" w:uiPriority="9" w:unhideWhenUsed="1" w:qFormat="1"/>
@@ -29799,11 +29781,6 @@
     <w:lsdException w:name="List Table 5 Dark Accent 6" w:uiPriority="50"/>
     <w:lsdException w:name="List Table 6 Colorful Accent 6" w:uiPriority="51"/>
     <w:lsdException w:name="List Table 7 Colorful Accent 6" w:uiPriority="52"/>
-    <w:lsdException w:name="Mention" w:semiHidden="1" w:unhideWhenUsed="1"/>
-    <w:lsdException w:name="Smart Hyperlink" w:semiHidden="1" w:unhideWhenUsed="1"/>
-    <w:lsdException w:name="Hashtag" w:semiHidden="1" w:unhideWhenUsed="1"/>
-    <w:lsdException w:name="Unresolved Mention" w:semiHidden="1" w:unhideWhenUsed="1"/>
-    <w:lsdException w:name="Smart Link" w:semiHidden="1" w:unhideWhenUsed="1"/>
   </w:latentStyles>
   <w:style w:type="paragraph" w:default="1" w:styleId="Normal">
     <w:name w:val="Normal"/>
@@ -30713,7 +30690,7 @@
 </file>
 
 <file path=customXml/itemProps1.xml><?xml version="1.0" encoding="utf-8"?>
-<ds:datastoreItem xmlns:ds="http://schemas.openxmlformats.org/officeDocument/2006/customXml" ds:itemID="{F134FAE6-A8EB-3548-9122-720128D9AC2F}">
+<ds:datastoreItem xmlns:ds="http://schemas.openxmlformats.org/officeDocument/2006/customXml" ds:itemID="{8A58C0FB-D57C-4317-8B12-6725B7713ED1}">
   <ds:schemaRefs>
     <ds:schemaRef ds:uri="http://schemas.openxmlformats.org/officeDocument/2006/bibliography"/>
   </ds:schemaRefs>

</xml_diff>